<commit_message>
Assignment 3 files are added
</commit_message>
<xml_diff>
--- a/Assignment2/results/340915149_206216517.docx
+++ b/Assignment2/results/340915149_206216517.docx
@@ -193,16 +193,71 @@
           <w:sz w:val="24"/>
           <w:szCs w:val="24"/>
         </w:rPr>
-        <w:t>pairsTest.txt: Contains 1000 pairs of images used for evaluating the one-shot performance. [Optional but good: This typically includes 500 matching pairs and 500 non-matching pairs].</w:t>
-      </w:r>
-    </w:p>
-    <w:p>
-      <w:pPr>
+        <w:t>pairsTest.txt: Contains 1000 pairs of images used for evaluating the one-shot performance.</w:t>
+      </w:r>
+      <w:r>
+        <w:rPr>
+          <w:rFonts w:asciiTheme="majorHAnsi" w:hAnsiTheme="majorHAnsi" w:cstheme="majorBidi" w:hint="cs"/>
+          <w:sz w:val="24"/>
+          <w:szCs w:val="24"/>
+          <w:rtl/>
+        </w:rPr>
+        <w:t xml:space="preserve"> </w:t>
+      </w:r>
+      <w:r>
+        <w:rPr>
+          <w:rFonts w:asciiTheme="majorHAnsi" w:hAnsiTheme="majorHAnsi" w:cstheme="majorBidi" w:hint="eastAsia"/>
+          <w:sz w:val="24"/>
+          <w:szCs w:val="24"/>
+          <w:lang w:eastAsia="ja-JP"/>
+        </w:rPr>
+        <w:t xml:space="preserve">550 </w:t>
+      </w:r>
+      <w:r>
         <w:rPr>
           <w:rFonts w:asciiTheme="majorHAnsi" w:hAnsiTheme="majorHAnsi" w:cstheme="majorBidi"/>
           <w:sz w:val="24"/>
           <w:szCs w:val="24"/>
-          <w:lang w:val="ru-RU"/>
+        </w:rPr>
+        <w:t xml:space="preserve">matching pairs (same person) and </w:t>
+      </w:r>
+      <w:r>
+        <w:rPr>
+          <w:rFonts w:asciiTheme="majorHAnsi" w:hAnsiTheme="majorHAnsi" w:cstheme="majorBidi" w:hint="eastAsia"/>
+          <w:sz w:val="24"/>
+          <w:szCs w:val="24"/>
+          <w:lang w:eastAsia="ja-JP"/>
+        </w:rPr>
+        <w:t>500</w:t>
+      </w:r>
+      <w:r>
+        <w:rPr>
+          <w:rFonts w:asciiTheme="majorHAnsi" w:hAnsiTheme="majorHAnsi" w:cstheme="majorBidi"/>
+          <w:sz w:val="24"/>
+          <w:szCs w:val="24"/>
+        </w:rPr>
+        <w:t xml:space="preserve"> non-matching pairs (different people).</w:t>
+      </w:r>
+    </w:p>
+    <w:p>
+      <w:pPr>
+        <w:numPr>
+          <w:ilvl w:val="0"/>
+          <w:numId w:val="24"/>
+        </w:numPr>
+        <w:rPr>
+          <w:rFonts w:asciiTheme="majorHAnsi" w:hAnsiTheme="majorHAnsi" w:cstheme="majorBidi"/>
+          <w:sz w:val="24"/>
+          <w:szCs w:val="24"/>
+        </w:rPr>
+      </w:pPr>
+    </w:p>
+    <w:p>
+      <w:pPr>
+        <w:rPr>
+          <w:rFonts w:asciiTheme="majorHAnsi" w:hAnsiTheme="majorHAnsi" w:cstheme="majorBidi"/>
+          <w:sz w:val="24"/>
+          <w:szCs w:val="24"/>
         </w:rPr>
       </w:pPr>
       <w:r>
@@ -228,7 +283,6 @@
           <w:rFonts w:asciiTheme="majorHAnsi" w:hAnsiTheme="majorHAnsi" w:cstheme="majorBidi"/>
           <w:sz w:val="24"/>
           <w:szCs w:val="24"/>
-          <w:lang w:val="ru-RU"/>
         </w:rPr>
         <w:t xml:space="preserve">We used an 80/20 </w:t>
       </w:r>
@@ -239,7 +293,7 @@
           <w:bCs/>
           <w:sz w:val="24"/>
           <w:szCs w:val="24"/>
-          <w:lang w:val="ru-RU" w:eastAsia="ja-JP"/>
+          <w:lang w:eastAsia="ja-JP"/>
         </w:rPr>
         <w:t>stratified</w:t>
       </w:r>
@@ -248,7 +302,7 @@
           <w:rFonts w:asciiTheme="majorHAnsi" w:hAnsiTheme="majorHAnsi" w:cstheme="majorBidi" w:hint="eastAsia"/>
           <w:sz w:val="24"/>
           <w:szCs w:val="24"/>
-          <w:lang w:val="ru-RU" w:eastAsia="ja-JP"/>
+          <w:lang w:eastAsia="ja-JP"/>
         </w:rPr>
         <w:t xml:space="preserve"> </w:t>
       </w:r>
@@ -257,7 +311,6 @@
           <w:rFonts w:asciiTheme="majorHAnsi" w:hAnsiTheme="majorHAnsi" w:cstheme="majorBidi"/>
           <w:sz w:val="24"/>
           <w:szCs w:val="24"/>
-          <w:lang w:val="ru-RU"/>
         </w:rPr>
         <w:t xml:space="preserve">split, resulting in: </w:t>
       </w:r>
@@ -275,6 +328,7 @@
           <w:lang w:val="ru-RU"/>
         </w:rPr>
       </w:pPr>
+      <w:proofErr w:type="spellStart"/>
       <w:r>
         <w:rPr>
           <w:rFonts w:asciiTheme="majorHAnsi" w:hAnsiTheme="majorHAnsi" w:cstheme="majorBidi"/>
@@ -282,7 +336,37 @@
           <w:szCs w:val="24"/>
           <w:lang w:val="ru-RU"/>
         </w:rPr>
-        <w:t>Training Pairs: 1760 (80% of 2200)</w:t>
+        <w:t>Training</w:t>
+      </w:r>
+      <w:proofErr w:type="spellEnd"/>
+      <w:r>
+        <w:rPr>
+          <w:rFonts w:asciiTheme="majorHAnsi" w:hAnsiTheme="majorHAnsi" w:cstheme="majorBidi"/>
+          <w:sz w:val="24"/>
+          <w:szCs w:val="24"/>
+          <w:lang w:val="ru-RU"/>
+        </w:rPr>
+        <w:t xml:space="preserve"> </w:t>
+      </w:r>
+      <w:proofErr w:type="spellStart"/>
+      <w:r>
+        <w:rPr>
+          <w:rFonts w:asciiTheme="majorHAnsi" w:hAnsiTheme="majorHAnsi" w:cstheme="majorBidi"/>
+          <w:sz w:val="24"/>
+          <w:szCs w:val="24"/>
+          <w:lang w:val="ru-RU"/>
+        </w:rPr>
+        <w:t>Pairs</w:t>
+      </w:r>
+      <w:proofErr w:type="spellEnd"/>
+      <w:r>
+        <w:rPr>
+          <w:rFonts w:asciiTheme="majorHAnsi" w:hAnsiTheme="majorHAnsi" w:cstheme="majorBidi"/>
+          <w:sz w:val="24"/>
+          <w:szCs w:val="24"/>
+          <w:lang w:val="ru-RU"/>
+        </w:rPr>
+        <w:t>: 1760 (80% of 2200)</w:t>
       </w:r>
     </w:p>
     <w:p>
@@ -305,19 +389,6 @@
         </w:rPr>
         <w:t>Validation Pairs: 440 (20% of 2200) The validation set was used for hyperparameter tuning and monitoring model generalization during training (e.g., selecting the best epoch).</w:t>
       </w:r>
-    </w:p>
-    <w:p>
-      <w:pPr>
-        <w:rPr>
-          <w:rFonts w:asciiTheme="majorHAnsi" w:hAnsiTheme="majorHAnsi" w:cstheme="majorBidi"/>
-          <w:b/>
-          <w:bCs/>
-          <w:sz w:val="24"/>
-          <w:szCs w:val="24"/>
-          <w:u w:val="single"/>
-          <w:lang w:eastAsia="ja-JP"/>
-        </w:rPr>
-      </w:pPr>
     </w:p>
     <w:p>
       <w:pPr>
@@ -1547,6 +1618,7 @@
           <w:sz w:val="24"/>
           <w:szCs w:val="24"/>
           <w:u w:val="single"/>
+          <w:rtl/>
         </w:rPr>
       </w:pPr>
     </w:p>
@@ -1571,6 +1643,7 @@
           <w:sz w:val="24"/>
           <w:szCs w:val="24"/>
           <w:u w:val="single"/>
+          <w:rtl/>
         </w:rPr>
       </w:pPr>
     </w:p>
@@ -1585,9 +1658,7 @@
           <w:u w:val="single"/>
         </w:rPr>
       </w:pPr>
-    </w:p>
-    <w:p>
-      <w:pPr>
+      <w:r>
         <w:rPr>
           <w:rFonts w:cstheme="majorBidi"/>
           <w:b/>
@@ -1596,16 +1667,7 @@
           <w:szCs w:val="24"/>
           <w:u w:val="single"/>
         </w:rPr>
-      </w:pPr>
-      <w:r>
-        <w:rPr>
-          <w:rFonts w:cstheme="majorBidi"/>
-          <w:b/>
-          <w:bCs/>
-          <w:sz w:val="24"/>
-          <w:szCs w:val="24"/>
-          <w:u w:val="single"/>
-        </w:rPr>
+        <w:lastRenderedPageBreak/>
         <w:t>Baseline Configuration Details:</w:t>
       </w:r>
     </w:p>
@@ -2473,6 +2535,42 @@
         </w:rPr>
         <w:t>Epochs: 10</w:t>
       </w:r>
+      <w:r>
+        <w:rPr>
+          <w:rFonts w:cstheme="majorBidi" w:hint="eastAsia"/>
+          <w:sz w:val="24"/>
+          <w:szCs w:val="24"/>
+          <w:lang w:eastAsia="ja-JP"/>
+        </w:rPr>
+        <w:t xml:space="preserve"> </w:t>
+      </w:r>
+      <w:r>
+        <w:rPr>
+          <w:rFonts w:cstheme="majorBidi"/>
+          <w:sz w:val="24"/>
+          <w:szCs w:val="24"/>
+          <w:lang w:eastAsia="ja-JP"/>
+        </w:rPr>
+        <w:t>–</w:t>
+      </w:r>
+      <w:r>
+        <w:rPr>
+          <w:rFonts w:cstheme="majorBidi" w:hint="eastAsia"/>
+          <w:sz w:val="24"/>
+          <w:szCs w:val="24"/>
+          <w:lang w:eastAsia="ja-JP"/>
+        </w:rPr>
+        <w:t xml:space="preserve"> it was sufficient to get model overfitted, we chose the </w:t>
+      </w:r>
+      <w:r>
+        <w:rPr>
+          <w:rFonts w:cstheme="majorBidi" w:hint="eastAsia"/>
+          <w:sz w:val="24"/>
+          <w:szCs w:val="24"/>
+          <w:lang w:eastAsia="ja-JP"/>
+        </w:rPr>
+        <w:t>model based on best validation accuracy</w:t>
+      </w:r>
     </w:p>
     <w:p>
       <w:pPr>
@@ -2538,69 +2636,108 @@
           <w:szCs w:val="24"/>
           <w:lang w:eastAsia="ja-JP"/>
         </w:rPr>
-        <w:t>We replicated the paper's setup as closely as possible to create a valid starting point, with the noted exception of using RGB input initially as the LFW dataset images are color.</w:t>
-      </w:r>
-    </w:p>
-    <w:p>
-      <w:pPr>
-        <w:rPr>
-          <w:rFonts w:cstheme="majorBidi"/>
-          <w:sz w:val="24"/>
-          <w:szCs w:val="24"/>
-        </w:rPr>
-      </w:pPr>
-    </w:p>
-    <w:p>
-      <w:pPr>
-        <w:rPr>
-          <w:rFonts w:cstheme="majorBidi"/>
-          <w:sz w:val="24"/>
-          <w:szCs w:val="24"/>
-        </w:rPr>
-      </w:pPr>
-    </w:p>
-    <w:p>
-      <w:pPr>
-        <w:rPr>
-          <w:rFonts w:cstheme="majorBidi"/>
-          <w:sz w:val="24"/>
-          <w:szCs w:val="24"/>
-        </w:rPr>
-      </w:pPr>
-    </w:p>
-    <w:p>
-      <w:pPr>
-        <w:rPr>
-          <w:rFonts w:cstheme="majorBidi"/>
-          <w:sz w:val="24"/>
-          <w:szCs w:val="24"/>
-        </w:rPr>
-      </w:pPr>
-    </w:p>
-    <w:p>
-      <w:pPr>
-        <w:rPr>
-          <w:rFonts w:cstheme="majorBidi"/>
-          <w:sz w:val="24"/>
-          <w:szCs w:val="24"/>
-        </w:rPr>
-      </w:pPr>
-    </w:p>
-    <w:p>
-      <w:pPr>
-        <w:rPr>
-          <w:rFonts w:cstheme="majorBidi"/>
-          <w:sz w:val="24"/>
-          <w:szCs w:val="24"/>
-        </w:rPr>
-      </w:pPr>
-    </w:p>
-    <w:p>
-      <w:pPr>
-        <w:rPr>
-          <w:rFonts w:cstheme="majorBidi"/>
-          <w:sz w:val="24"/>
-          <w:szCs w:val="24"/>
+        <w:t xml:space="preserve">We replicated the paper's setup as closely as possible to create a valid starting point, </w:t>
+      </w:r>
+      <w:r>
+        <w:rPr>
+          <w:rFonts w:cstheme="majorBidi"/>
+          <w:sz w:val="24"/>
+          <w:szCs w:val="24"/>
+          <w:lang w:eastAsia="ja-JP"/>
+        </w:rPr>
+        <w:t>we transformed input images to grayscale</w:t>
+      </w:r>
+      <w:r>
+        <w:rPr>
+          <w:rFonts w:cstheme="majorBidi"/>
+          <w:sz w:val="24"/>
+          <w:szCs w:val="24"/>
+          <w:lang w:eastAsia="ja-JP"/>
+        </w:rPr>
+        <w:t xml:space="preserve"> initiall</w:t>
+      </w:r>
+      <w:r>
+        <w:rPr>
+          <w:rFonts w:cstheme="majorBidi"/>
+          <w:sz w:val="24"/>
+          <w:szCs w:val="24"/>
+          <w:lang w:eastAsia="ja-JP"/>
+        </w:rPr>
+        <w:t>y</w:t>
+      </w:r>
+      <w:r>
+        <w:rPr>
+          <w:rFonts w:cstheme="majorBidi"/>
+          <w:sz w:val="24"/>
+          <w:szCs w:val="24"/>
+          <w:lang w:eastAsia="ja-JP"/>
+        </w:rPr>
+        <w:t>.</w:t>
+      </w:r>
+    </w:p>
+    <w:p>
+      <w:pPr>
+        <w:rPr>
+          <w:rFonts w:cstheme="majorBidi"/>
+          <w:sz w:val="24"/>
+          <w:szCs w:val="24"/>
+        </w:rPr>
+      </w:pPr>
+    </w:p>
+    <w:p>
+      <w:pPr>
+        <w:rPr>
+          <w:rFonts w:cstheme="majorBidi"/>
+          <w:sz w:val="24"/>
+          <w:szCs w:val="24"/>
+        </w:rPr>
+      </w:pPr>
+    </w:p>
+    <w:p>
+      <w:pPr>
+        <w:rPr>
+          <w:rFonts w:cstheme="majorBidi"/>
+          <w:sz w:val="24"/>
+          <w:szCs w:val="24"/>
+        </w:rPr>
+      </w:pPr>
+    </w:p>
+    <w:p>
+      <w:pPr>
+        <w:rPr>
+          <w:rFonts w:cstheme="majorBidi"/>
+          <w:sz w:val="24"/>
+          <w:szCs w:val="24"/>
+          <w:rtl/>
+        </w:rPr>
+      </w:pPr>
+    </w:p>
+    <w:p>
+      <w:pPr>
+        <w:rPr>
+          <w:rFonts w:cstheme="majorBidi"/>
+          <w:sz w:val="24"/>
+          <w:szCs w:val="24"/>
+          <w:rtl/>
+        </w:rPr>
+      </w:pPr>
+    </w:p>
+    <w:p>
+      <w:pPr>
+        <w:rPr>
+          <w:rFonts w:cstheme="majorBidi"/>
+          <w:sz w:val="24"/>
+          <w:szCs w:val="24"/>
+        </w:rPr>
+      </w:pPr>
+    </w:p>
+    <w:p>
+      <w:pPr>
+        <w:rPr>
+          <w:rFonts w:cstheme="majorBidi"/>
+          <w:sz w:val="24"/>
+          <w:szCs w:val="24"/>
+          <w:rtl/>
         </w:rPr>
       </w:pPr>
     </w:p>
@@ -2625,6 +2762,7 @@
           <w:u w:val="single"/>
           <w:lang w:eastAsia="ja-JP"/>
         </w:rPr>
+        <w:lastRenderedPageBreak/>
         <w:t xml:space="preserve">Baseline Model </w:t>
       </w:r>
       <w:r>
@@ -2716,6 +2854,7 @@
                 <w14:ligatures w14:val="none"/>
               </w:rPr>
             </w:pPr>
+            <w:proofErr w:type="spellStart"/>
             <w:r>
               <w:rPr>
                 <w:rFonts w:ascii="Aptos Narrow" w:eastAsia="Times New Roman" w:hAnsi="Aptos Narrow" w:cs="Times New Roman"/>
@@ -2726,6 +2865,7 @@
               </w:rPr>
               <w:t>Loss</w:t>
             </w:r>
+            <w:proofErr w:type="spellEnd"/>
           </w:p>
         </w:tc>
         <w:tc>
@@ -2749,6 +2889,7 @@
                 <w14:ligatures w14:val="none"/>
               </w:rPr>
             </w:pPr>
+            <w:proofErr w:type="spellStart"/>
             <w:r>
               <w:rPr>
                 <w:rFonts w:ascii="Aptos Narrow" w:eastAsia="Times New Roman" w:hAnsi="Aptos Narrow" w:cs="Times New Roman"/>
@@ -2759,6 +2900,7 @@
               </w:rPr>
               <w:t>Accuracy</w:t>
             </w:r>
+            <w:proofErr w:type="spellEnd"/>
           </w:p>
         </w:tc>
         <w:tc>
@@ -2807,6 +2949,7 @@
                 <w14:ligatures w14:val="none"/>
               </w:rPr>
             </w:pPr>
+            <w:proofErr w:type="spellStart"/>
             <w:r>
               <w:rPr>
                 <w:rFonts w:ascii="Aptos Narrow" w:eastAsia="Times New Roman" w:hAnsi="Aptos Narrow" w:cs="Times New Roman"/>
@@ -2817,6 +2960,7 @@
               </w:rPr>
               <w:t>Training</w:t>
             </w:r>
+            <w:proofErr w:type="spellEnd"/>
           </w:p>
         </w:tc>
         <w:tc>
@@ -2838,6 +2982,7 @@
                 <w14:ligatures w14:val="none"/>
               </w:rPr>
             </w:pPr>
+            <w:proofErr w:type="spellStart"/>
             <w:r>
               <w:rPr>
                 <w:rFonts w:ascii="Aptos Narrow" w:eastAsia="Times New Roman" w:hAnsi="Aptos Narrow" w:cs="Times New Roman"/>
@@ -2848,6 +2993,7 @@
               </w:rPr>
               <w:t>Validation</w:t>
             </w:r>
+            <w:proofErr w:type="spellEnd"/>
           </w:p>
         </w:tc>
         <w:tc>
@@ -2900,6 +3046,7 @@
                 <w14:ligatures w14:val="none"/>
               </w:rPr>
             </w:pPr>
+            <w:proofErr w:type="spellStart"/>
             <w:r>
               <w:rPr>
                 <w:rFonts w:ascii="Aptos Narrow" w:eastAsia="Times New Roman" w:hAnsi="Aptos Narrow" w:cs="Times New Roman"/>
@@ -2910,6 +3057,7 @@
               </w:rPr>
               <w:t>Training</w:t>
             </w:r>
+            <w:proofErr w:type="spellEnd"/>
           </w:p>
         </w:tc>
         <w:tc>
@@ -2931,6 +3079,7 @@
                 <w14:ligatures w14:val="none"/>
               </w:rPr>
             </w:pPr>
+            <w:proofErr w:type="spellStart"/>
             <w:r>
               <w:rPr>
                 <w:rFonts w:ascii="Aptos Narrow" w:eastAsia="Times New Roman" w:hAnsi="Aptos Narrow" w:cs="Times New Roman"/>
@@ -2941,6 +3090,7 @@
               </w:rPr>
               <w:t>Validation</w:t>
             </w:r>
+            <w:proofErr w:type="spellEnd"/>
           </w:p>
         </w:tc>
         <w:tc>
@@ -2993,6 +3143,7 @@
                 <w14:ligatures w14:val="none"/>
               </w:rPr>
             </w:pPr>
+            <w:proofErr w:type="spellStart"/>
             <w:r>
               <w:rPr>
                 <w:rFonts w:ascii="Aptos Narrow" w:eastAsia="Times New Roman" w:hAnsi="Aptos Narrow" w:cs="Times New Roman"/>
@@ -3001,7 +3152,18 @@
                 <w:lang w:val="ru-RU" w:eastAsia="ja-JP"/>
                 <w14:ligatures w14:val="none"/>
               </w:rPr>
-              <w:t>Training Time</w:t>
+              <w:t>Training</w:t>
+            </w:r>
+            <w:proofErr w:type="spellEnd"/>
+            <w:r>
+              <w:rPr>
+                <w:rFonts w:ascii="Aptos Narrow" w:eastAsia="Times New Roman" w:hAnsi="Aptos Narrow" w:cs="Times New Roman"/>
+                <w:color w:val="000000"/>
+                <w:kern w:val="0"/>
+                <w:lang w:val="ru-RU" w:eastAsia="ja-JP"/>
+                <w14:ligatures w14:val="none"/>
+              </w:rPr>
+              <w:t xml:space="preserve"> Time</w:t>
             </w:r>
           </w:p>
         </w:tc>
@@ -3229,8 +3391,20 @@
                 <w:lang w:val="ru-RU" w:eastAsia="ja-JP"/>
                 <w14:ligatures w14:val="none"/>
               </w:rPr>
-              <w:t>99.76 seconds</w:t>
+              <w:t xml:space="preserve">99.76 </w:t>
             </w:r>
+            <w:proofErr w:type="spellStart"/>
+            <w:r>
+              <w:rPr>
+                <w:rFonts w:ascii="Aptos Narrow" w:eastAsia="Times New Roman" w:hAnsi="Aptos Narrow" w:cs="Times New Roman"/>
+                <w:color w:val="000000"/>
+                <w:kern w:val="0"/>
+                <w:lang w:val="ru-RU" w:eastAsia="ja-JP"/>
+                <w14:ligatures w14:val="none"/>
+              </w:rPr>
+              <w:t>seconds</w:t>
+            </w:r>
+            <w:proofErr w:type="spellEnd"/>
           </w:p>
         </w:tc>
       </w:tr>
@@ -3523,6 +3697,21 @@
           <w:sz w:val="24"/>
           <w:szCs w:val="24"/>
           <w:u w:val="single"/>
+          <w:rtl/>
+          <w:lang w:eastAsia="ja-JP"/>
+        </w:rPr>
+      </w:pPr>
+    </w:p>
+    <w:p>
+      <w:pPr>
+        <w:rPr>
+          <w:rFonts w:cstheme="majorBidi"/>
+          <w:b/>
+          <w:bCs/>
+          <w:sz w:val="24"/>
+          <w:szCs w:val="24"/>
+          <w:u w:val="single"/>
+          <w:rtl/>
           <w:lang w:eastAsia="ja-JP"/>
         </w:rPr>
       </w:pPr>
@@ -3642,6 +3831,15 @@
         </w:rPr>
         <w:t xml:space="preserve"> performance to guide our decisions.</w:t>
       </w:r>
+    </w:p>
+    <w:p>
+      <w:pPr>
+        <w:rPr>
+          <w:rFonts w:cstheme="majorBidi"/>
+          <w:sz w:val="24"/>
+          <w:szCs w:val="24"/>
+        </w:rPr>
+      </w:pPr>
     </w:p>
     <w:p>
       <w:pPr>
@@ -3666,7 +3864,7 @@
           <w:sz w:val="24"/>
           <w:szCs w:val="24"/>
         </w:rPr>
-        <w:t>Optimizer Change: SGD to Adam</w:t>
+        <w:t>Grayscale to RGB</w:t>
       </w:r>
     </w:p>
     <w:p>
@@ -3701,49 +3899,7 @@
           <w:rFonts w:asciiTheme="minorHAnsi" w:eastAsiaTheme="minorEastAsia" w:hAnsiTheme="minorHAnsi"/>
           <w:lang w:val="en-US"/>
         </w:rPr>
-        <w:t xml:space="preserve">While SGD was popular at </w:t>
-      </w:r>
-      <w:r>
-        <w:rPr>
-          <w:rFonts w:asciiTheme="minorHAnsi" w:eastAsiaTheme="minorEastAsia" w:hAnsiTheme="minorHAnsi"/>
-          <w:lang w:val="en-US"/>
-        </w:rPr>
-        <w:t>the time</w:t>
-      </w:r>
-      <w:r>
-        <w:rPr>
-          <w:rFonts w:asciiTheme="minorHAnsi" w:eastAsiaTheme="minorEastAsia" w:hAnsiTheme="minorHAnsi"/>
-          <w:lang w:val="en-US"/>
-        </w:rPr>
-        <w:t xml:space="preserve"> the paper was publish</w:t>
-      </w:r>
-      <w:r>
-        <w:rPr>
-          <w:rFonts w:asciiTheme="minorHAnsi" w:eastAsiaTheme="minorEastAsia" w:hAnsiTheme="minorHAnsi" w:hint="eastAsia"/>
-          <w:lang w:val="en-US"/>
-        </w:rPr>
-        <w:t>ed</w:t>
-      </w:r>
-      <w:r>
-        <w:rPr>
-          <w:rFonts w:asciiTheme="minorHAnsi" w:eastAsiaTheme="minorEastAsia" w:hAnsiTheme="minorHAnsi"/>
-          <w:lang w:val="en-US"/>
-        </w:rPr>
-        <w:t xml:space="preserve">, currently </w:t>
-      </w:r>
-      <w:r>
-        <w:rPr>
-          <w:rFonts w:asciiTheme="minorHAnsi" w:hAnsiTheme="minorHAnsi"/>
-          <w:lang w:val="en-US"/>
-        </w:rPr>
-        <w:t>Adam is a widely used optimizer known for adaptive learning rates and often faster convergence compared to SGD</w:t>
-      </w:r>
-      <w:r>
-        <w:rPr>
-          <w:rFonts w:asciiTheme="minorHAnsi" w:eastAsiaTheme="minorEastAsia" w:hAnsiTheme="minorHAnsi"/>
-          <w:lang w:val="en-US"/>
-        </w:rPr>
-        <w:t>.</w:t>
+        <w:t>Although the original images were in black and white, we experimented with treating the inputs as RGB images. The motivation was to explore whether processing the images as three-channel inputs might help the model capture additional patterns or features.</w:t>
       </w:r>
     </w:p>
     <w:p>
@@ -3771,94 +3927,42 @@
           <w:rFonts w:asciiTheme="minorHAnsi" w:hAnsiTheme="minorHAnsi"/>
           <w:lang w:val="en-US"/>
         </w:rPr>
-        <w:t xml:space="preserve"> Replaced SGD with Adam optimizer, </w:t>
-      </w:r>
-      <w:r>
-        <w:rPr>
-          <w:rFonts w:asciiTheme="minorHAnsi" w:eastAsiaTheme="minorEastAsia" w:hAnsiTheme="minorHAnsi"/>
-          <w:lang w:val="en-US"/>
-        </w:rPr>
-        <w:t>reduced</w:t>
+        <w:t xml:space="preserve"> </w:t>
       </w:r>
       <w:r>
         <w:rPr>
           <w:rFonts w:asciiTheme="minorHAnsi" w:hAnsiTheme="minorHAnsi"/>
           <w:lang w:val="en-US"/>
         </w:rPr>
-        <w:t xml:space="preserve"> L</w:t>
-      </w:r>
-      <w:r>
-        <w:rPr>
-          <w:rFonts w:asciiTheme="minorHAnsi" w:eastAsiaTheme="minorEastAsia" w:hAnsiTheme="minorHAnsi"/>
-          <w:lang w:val="en-US"/>
-        </w:rPr>
-        <w:t xml:space="preserve">earning </w:t>
+        <w:t>The transformation to grayscale was removed, and images were instead processed as RGB with three input channels. All other baseline parameters were kept constant</w:t>
       </w:r>
       <w:r>
         <w:rPr>
           <w:rFonts w:asciiTheme="minorHAnsi" w:hAnsiTheme="minorHAnsi"/>
           <w:lang w:val="en-US"/>
         </w:rPr>
-        <w:t>R</w:t>
-      </w:r>
-      <w:r>
-        <w:rPr>
-          <w:rFonts w:asciiTheme="minorHAnsi" w:eastAsiaTheme="minorEastAsia" w:hAnsiTheme="minorHAnsi"/>
-          <w:lang w:val="en-US"/>
-        </w:rPr>
-        <w:t>ate to</w:t>
+        <w:t>.</w:t>
       </w:r>
       <w:r>
         <w:rPr>
           <w:rFonts w:asciiTheme="minorHAnsi" w:hAnsiTheme="minorHAnsi"/>
           <w:lang w:val="en-US"/>
         </w:rPr>
-        <w:t xml:space="preserve"> </w:t>
-      </w:r>
-      <m:oMath>
-        <m:sSup>
-          <m:sSupPr>
-            <m:ctrlPr>
-              <w:rPr>
-                <w:rFonts w:ascii="Cambria Math" w:eastAsiaTheme="minorEastAsia" w:hAnsi="Cambria Math"/>
-                <w:i/>
-                <w:lang w:val="en-US"/>
-              </w:rPr>
-            </m:ctrlPr>
-          </m:sSupPr>
-          <m:e>
-            <m:r>
-              <w:rPr>
-                <w:rFonts w:ascii="Cambria Math" w:hAnsi="Cambria Math"/>
-                <w:lang w:val="en-US"/>
-              </w:rPr>
-              <m:t>1</m:t>
-            </m:r>
-            <m:r>
-              <w:rPr>
-                <w:rFonts w:ascii="Cambria Math" w:eastAsiaTheme="minorEastAsia" w:hAnsi="Cambria Math"/>
-                <w:lang w:val="en-US"/>
-              </w:rPr>
-              <m:t>0</m:t>
-            </m:r>
-          </m:e>
-          <m:sup>
-            <m:r>
-              <w:rPr>
-                <w:rFonts w:ascii="Cambria Math" w:eastAsiaTheme="minorEastAsia" w:hAnsi="Cambria Math"/>
-                <w:lang w:val="en-US"/>
-              </w:rPr>
-              <m:t>-5</m:t>
-            </m:r>
-          </m:sup>
-        </m:sSup>
-      </m:oMath>
+        <w:t xml:space="preserve"> All other baseline parameters remained (</w:t>
+      </w:r>
       <w:r>
         <w:rPr>
           <w:rFonts w:asciiTheme="minorHAnsi" w:hAnsiTheme="minorHAnsi"/>
           <w:lang w:val="en-US"/>
         </w:rPr>
-        <w:t xml:space="preserve">. All other baseline parameters remained (RGB input, Embed Dim 4096, paper's weight </w:t>
+        <w:t xml:space="preserve">SGD Optimizer, </w:t>
+      </w:r>
+      <w:r>
+        <w:rPr>
+          <w:rFonts w:asciiTheme="minorHAnsi" w:hAnsiTheme="minorHAnsi"/>
+          <w:lang w:val="en-US"/>
+        </w:rPr>
+        <w:t xml:space="preserve">Embed Dim 4096, paper's weight </w:t>
       </w:r>
       <w:r>
         <w:rPr>
@@ -3897,7 +4001,7 @@
       <w:r>
         <w:rPr>
           <w:rStyle w:val="Strong"/>
-          <w:rFonts w:asciiTheme="minorHAnsi" w:eastAsiaTheme="majorEastAsia" w:hAnsiTheme="minorHAnsi" w:hint="eastAsia"/>
+          <w:rFonts w:asciiTheme="minorHAnsi" w:eastAsiaTheme="majorEastAsia" w:hAnsiTheme="minorHAnsi"/>
           <w:lang w:val="en-US"/>
         </w:rPr>
         <w:t>Results:</w:t>
@@ -3953,6 +4057,7 @@
                 <w14:ligatures w14:val="none"/>
               </w:rPr>
             </w:pPr>
+            <w:proofErr w:type="spellStart"/>
             <w:r>
               <w:rPr>
                 <w:rFonts w:eastAsia="Times New Roman" w:cs="Times New Roman"/>
@@ -3965,6 +4070,7 @@
               </w:rPr>
               <w:t>Loss</w:t>
             </w:r>
+            <w:proofErr w:type="spellEnd"/>
           </w:p>
         </w:tc>
         <w:tc>
@@ -3990,6 +4096,7 @@
                 <w14:ligatures w14:val="none"/>
               </w:rPr>
             </w:pPr>
+            <w:proofErr w:type="spellStart"/>
             <w:r>
               <w:rPr>
                 <w:rFonts w:eastAsia="Times New Roman" w:cs="Times New Roman"/>
@@ -4002,6 +4109,7 @@
               </w:rPr>
               <w:t>Accuracy</w:t>
             </w:r>
+            <w:proofErr w:type="spellEnd"/>
           </w:p>
         </w:tc>
         <w:tc>
@@ -4054,6 +4162,7 @@
                 <w14:ligatures w14:val="none"/>
               </w:rPr>
             </w:pPr>
+            <w:proofErr w:type="spellStart"/>
             <w:r>
               <w:rPr>
                 <w:rFonts w:eastAsia="Times New Roman" w:cs="Times New Roman"/>
@@ -4066,6 +4175,7 @@
               </w:rPr>
               <w:t>Training</w:t>
             </w:r>
+            <w:proofErr w:type="spellEnd"/>
           </w:p>
         </w:tc>
         <w:tc>
@@ -4089,6 +4199,7 @@
                 <w14:ligatures w14:val="none"/>
               </w:rPr>
             </w:pPr>
+            <w:proofErr w:type="spellStart"/>
             <w:r>
               <w:rPr>
                 <w:rFonts w:eastAsia="Times New Roman" w:cs="Times New Roman"/>
@@ -4101,6 +4212,7 @@
               </w:rPr>
               <w:t>Validation</w:t>
             </w:r>
+            <w:proofErr w:type="spellEnd"/>
           </w:p>
         </w:tc>
         <w:tc>
@@ -4159,6 +4271,7 @@
                 <w14:ligatures w14:val="none"/>
               </w:rPr>
             </w:pPr>
+            <w:proofErr w:type="spellStart"/>
             <w:r>
               <w:rPr>
                 <w:rFonts w:eastAsia="Times New Roman" w:cs="Times New Roman"/>
@@ -4171,6 +4284,7 @@
               </w:rPr>
               <w:t>Training</w:t>
             </w:r>
+            <w:proofErr w:type="spellEnd"/>
           </w:p>
         </w:tc>
         <w:tc>
@@ -4194,6 +4308,7 @@
                 <w14:ligatures w14:val="none"/>
               </w:rPr>
             </w:pPr>
+            <w:proofErr w:type="spellStart"/>
             <w:r>
               <w:rPr>
                 <w:rFonts w:eastAsia="Times New Roman" w:cs="Times New Roman"/>
@@ -4206,6 +4321,7 @@
               </w:rPr>
               <w:t>Validation</w:t>
             </w:r>
+            <w:proofErr w:type="spellEnd"/>
           </w:p>
         </w:tc>
         <w:tc>
@@ -4264,6 +4380,7 @@
                 <w14:ligatures w14:val="none"/>
               </w:rPr>
             </w:pPr>
+            <w:proofErr w:type="spellStart"/>
             <w:r>
               <w:rPr>
                 <w:rFonts w:eastAsia="Times New Roman" w:cs="Times New Roman"/>
@@ -4274,7 +4391,20 @@
                 <w:lang w:val="ru-RU" w:eastAsia="ja-JP"/>
                 <w14:ligatures w14:val="none"/>
               </w:rPr>
-              <w:t>Training Time</w:t>
+              <w:t>Training</w:t>
+            </w:r>
+            <w:proofErr w:type="spellEnd"/>
+            <w:r>
+              <w:rPr>
+                <w:rFonts w:eastAsia="Times New Roman" w:cs="Times New Roman"/>
+                <w:color w:val="000000"/>
+                <w:kern w:val="0"/>
+                <w:sz w:val="24"/>
+                <w:szCs w:val="24"/>
+                <w:lang w:val="ru-RU" w:eastAsia="ja-JP"/>
+                <w14:ligatures w14:val="none"/>
+              </w:rPr>
+              <w:t xml:space="preserve"> Time</w:t>
             </w:r>
           </w:p>
         </w:tc>
@@ -4315,6 +4445,1292 @@
                 <w:lang w:val="ru-RU" w:eastAsia="ja-JP"/>
                 <w14:ligatures w14:val="none"/>
               </w:rPr>
+              <w:t>0.</w:t>
+            </w:r>
+            <w:r>
+              <w:rPr>
+                <w:rFonts w:eastAsia="Times New Roman" w:cs="Times New Roman"/>
+                <w:color w:val="000000"/>
+                <w:kern w:val="0"/>
+                <w:sz w:val="24"/>
+                <w:szCs w:val="24"/>
+                <w:lang w:val="ru-RU" w:eastAsia="ja-JP"/>
+                <w14:ligatures w14:val="none"/>
+              </w:rPr>
+              <w:t>2648</w:t>
+            </w:r>
+          </w:p>
+        </w:tc>
+        <w:tc>
+          <w:tcPr>
+            <w:tcW w:w="0" w:type="auto"/>
+            <w:shd w:val="clear" w:color="auto" w:fill="auto"/>
+            <w:noWrap/>
+            <w:vAlign w:val="bottom"/>
+            <w:hideMark/>
+          </w:tcPr>
+          <w:p>
+            <w:pPr>
+              <w:spacing w:after="0" w:line="240" w:lineRule="auto"/>
+              <w:jc w:val="right"/>
+              <w:rPr>
+                <w:rFonts w:eastAsia="Times New Roman" w:cs="Times New Roman"/>
+                <w:color w:val="000000"/>
+                <w:kern w:val="0"/>
+                <w:sz w:val="24"/>
+                <w:szCs w:val="24"/>
+                <w:lang w:val="ru-RU" w:eastAsia="ja-JP"/>
+                <w14:ligatures w14:val="none"/>
+              </w:rPr>
+            </w:pPr>
+            <w:r>
+              <w:rPr>
+                <w:rFonts w:eastAsia="Times New Roman" w:cs="Times New Roman"/>
+                <w:color w:val="000000"/>
+                <w:kern w:val="0"/>
+                <w:sz w:val="24"/>
+                <w:szCs w:val="24"/>
+                <w:lang w:val="ru-RU" w:eastAsia="ja-JP"/>
+                <w14:ligatures w14:val="none"/>
+              </w:rPr>
+              <w:t>0.</w:t>
+            </w:r>
+            <w:r>
+              <w:rPr>
+                <w:rFonts w:eastAsia="Times New Roman" w:cs="Times New Roman"/>
+                <w:color w:val="000000"/>
+                <w:kern w:val="0"/>
+                <w:sz w:val="24"/>
+                <w:szCs w:val="24"/>
+                <w:lang w:val="ru-RU" w:eastAsia="ja-JP"/>
+                <w14:ligatures w14:val="none"/>
+              </w:rPr>
+              <w:t>8802</w:t>
+            </w:r>
+          </w:p>
+        </w:tc>
+        <w:tc>
+          <w:tcPr>
+            <w:tcW w:w="0" w:type="auto"/>
+            <w:shd w:val="clear" w:color="auto" w:fill="auto"/>
+            <w:noWrap/>
+            <w:vAlign w:val="bottom"/>
+            <w:hideMark/>
+          </w:tcPr>
+          <w:p>
+            <w:pPr>
+              <w:spacing w:after="0" w:line="240" w:lineRule="auto"/>
+              <w:jc w:val="right"/>
+              <w:rPr>
+                <w:rFonts w:eastAsia="Times New Roman" w:cs="Times New Roman"/>
+                <w:color w:val="000000"/>
+                <w:kern w:val="0"/>
+                <w:sz w:val="24"/>
+                <w:szCs w:val="24"/>
+                <w:lang w:val="ru-RU" w:eastAsia="ja-JP"/>
+                <w14:ligatures w14:val="none"/>
+              </w:rPr>
+            </w:pPr>
+            <w:r>
+              <w:rPr>
+                <w:rFonts w:eastAsia="Times New Roman" w:cs="Times New Roman"/>
+                <w:color w:val="000000"/>
+                <w:kern w:val="0"/>
+                <w:sz w:val="24"/>
+                <w:szCs w:val="24"/>
+                <w:lang w:val="ru-RU" w:eastAsia="ja-JP"/>
+                <w14:ligatures w14:val="none"/>
+              </w:rPr>
+              <w:t>0.</w:t>
+            </w:r>
+            <w:r>
+              <w:rPr>
+                <w:rFonts w:eastAsia="Times New Roman" w:cs="Times New Roman"/>
+                <w:color w:val="000000"/>
+                <w:kern w:val="0"/>
+                <w:sz w:val="24"/>
+                <w:szCs w:val="24"/>
+                <w:lang w:val="ru-RU" w:eastAsia="ja-JP"/>
+                <w14:ligatures w14:val="none"/>
+              </w:rPr>
+              <w:t>9227</w:t>
+            </w:r>
+          </w:p>
+        </w:tc>
+        <w:tc>
+          <w:tcPr>
+            <w:tcW w:w="0" w:type="auto"/>
+            <w:shd w:val="clear" w:color="auto" w:fill="auto"/>
+            <w:noWrap/>
+            <w:vAlign w:val="bottom"/>
+            <w:hideMark/>
+          </w:tcPr>
+          <w:p>
+            <w:pPr>
+              <w:spacing w:after="0" w:line="240" w:lineRule="auto"/>
+              <w:jc w:val="right"/>
+              <w:rPr>
+                <w:rFonts w:eastAsia="Times New Roman" w:cs="Times New Roman"/>
+                <w:color w:val="000000"/>
+                <w:kern w:val="0"/>
+                <w:sz w:val="24"/>
+                <w:szCs w:val="24"/>
+                <w:lang w:val="ru-RU" w:eastAsia="ja-JP"/>
+                <w14:ligatures w14:val="none"/>
+              </w:rPr>
+            </w:pPr>
+            <w:r>
+              <w:rPr>
+                <w:rFonts w:eastAsia="Times New Roman" w:cs="Times New Roman"/>
+                <w:color w:val="000000"/>
+                <w:kern w:val="0"/>
+                <w:sz w:val="24"/>
+                <w:szCs w:val="24"/>
+                <w:lang w:val="ru-RU" w:eastAsia="ja-JP"/>
+                <w14:ligatures w14:val="none"/>
+              </w:rPr>
+              <w:t>0.9</w:t>
+            </w:r>
+            <w:r>
+              <w:rPr>
+                <w:rFonts w:eastAsia="Times New Roman" w:cs="Times New Roman"/>
+                <w:color w:val="000000"/>
+                <w:kern w:val="0"/>
+                <w:sz w:val="24"/>
+                <w:szCs w:val="24"/>
+                <w:lang w:val="ru-RU" w:eastAsia="ja-JP"/>
+                <w14:ligatures w14:val="none"/>
+              </w:rPr>
+              <w:t>23</w:t>
+            </w:r>
+            <w:r>
+              <w:rPr>
+                <w:rFonts w:eastAsia="Times New Roman" w:cs="Times New Roman"/>
+                <w:color w:val="000000"/>
+                <w:kern w:val="0"/>
+                <w:sz w:val="24"/>
+                <w:szCs w:val="24"/>
+                <w:lang w:val="ru-RU" w:eastAsia="ja-JP"/>
+                <w14:ligatures w14:val="none"/>
+              </w:rPr>
+              <w:t>7</w:t>
+            </w:r>
+          </w:p>
+        </w:tc>
+        <w:tc>
+          <w:tcPr>
+            <w:tcW w:w="0" w:type="auto"/>
+            <w:shd w:val="clear" w:color="auto" w:fill="auto"/>
+            <w:noWrap/>
+            <w:vAlign w:val="bottom"/>
+            <w:hideMark/>
+          </w:tcPr>
+          <w:p>
+            <w:pPr>
+              <w:spacing w:after="0" w:line="240" w:lineRule="auto"/>
+              <w:jc w:val="right"/>
+              <w:rPr>
+                <w:rFonts w:eastAsia="Times New Roman" w:cs="Times New Roman"/>
+                <w:color w:val="000000"/>
+                <w:kern w:val="0"/>
+                <w:sz w:val="24"/>
+                <w:szCs w:val="24"/>
+                <w:lang w:val="ru-RU" w:eastAsia="ja-JP"/>
+                <w14:ligatures w14:val="none"/>
+              </w:rPr>
+            </w:pPr>
+            <w:r>
+              <w:rPr>
+                <w:rFonts w:eastAsia="Times New Roman" w:cs="Times New Roman"/>
+                <w:color w:val="000000"/>
+                <w:kern w:val="0"/>
+                <w:sz w:val="24"/>
+                <w:szCs w:val="24"/>
+                <w:lang w:val="ru-RU" w:eastAsia="ja-JP"/>
+                <w14:ligatures w14:val="none"/>
+              </w:rPr>
+              <w:t>0.</w:t>
+            </w:r>
+            <w:r>
+              <w:rPr>
+                <w:rFonts w:eastAsia="Times New Roman" w:cs="Times New Roman"/>
+                <w:color w:val="000000"/>
+                <w:kern w:val="0"/>
+                <w:sz w:val="24"/>
+                <w:szCs w:val="24"/>
+                <w:lang w:val="ru-RU" w:eastAsia="ja-JP"/>
+                <w14:ligatures w14:val="none"/>
+              </w:rPr>
+              <w:t>59</w:t>
+            </w:r>
+            <w:r>
+              <w:rPr>
+                <w:rFonts w:eastAsia="Times New Roman" w:cs="Times New Roman"/>
+                <w:color w:val="000000"/>
+                <w:kern w:val="0"/>
+                <w:sz w:val="24"/>
+                <w:szCs w:val="24"/>
+                <w:lang w:val="ru-RU" w:eastAsia="ja-JP"/>
+                <w14:ligatures w14:val="none"/>
+              </w:rPr>
+              <w:t>09</w:t>
+            </w:r>
+          </w:p>
+        </w:tc>
+        <w:tc>
+          <w:tcPr>
+            <w:tcW w:w="0" w:type="auto"/>
+            <w:shd w:val="clear" w:color="auto" w:fill="auto"/>
+            <w:noWrap/>
+            <w:vAlign w:val="bottom"/>
+            <w:hideMark/>
+          </w:tcPr>
+          <w:p>
+            <w:pPr>
+              <w:spacing w:after="0" w:line="240" w:lineRule="auto"/>
+              <w:jc w:val="right"/>
+              <w:rPr>
+                <w:rFonts w:eastAsia="Times New Roman" w:cs="Times New Roman"/>
+                <w:color w:val="000000"/>
+                <w:kern w:val="0"/>
+                <w:sz w:val="24"/>
+                <w:szCs w:val="24"/>
+                <w:lang w:val="ru-RU" w:eastAsia="ja-JP"/>
+                <w14:ligatures w14:val="none"/>
+              </w:rPr>
+            </w:pPr>
+            <w:r>
+              <w:rPr>
+                <w:rFonts w:eastAsia="Times New Roman" w:cs="Times New Roman"/>
+                <w:color w:val="000000"/>
+                <w:kern w:val="0"/>
+                <w:sz w:val="24"/>
+                <w:szCs w:val="24"/>
+                <w:lang w:val="ru-RU" w:eastAsia="ja-JP"/>
+                <w14:ligatures w14:val="none"/>
+              </w:rPr>
+              <w:t>0.</w:t>
+            </w:r>
+            <w:r>
+              <w:rPr>
+                <w:rFonts w:eastAsia="Times New Roman" w:cs="Times New Roman"/>
+                <w:color w:val="000000"/>
+                <w:kern w:val="0"/>
+                <w:sz w:val="24"/>
+                <w:szCs w:val="24"/>
+                <w:lang w:val="ru-RU" w:eastAsia="ja-JP"/>
+                <w14:ligatures w14:val="none"/>
+              </w:rPr>
+              <w:t>56</w:t>
+            </w:r>
+            <w:r>
+              <w:rPr>
+                <w:rFonts w:eastAsia="Times New Roman" w:cs="Times New Roman"/>
+                <w:color w:val="000000"/>
+                <w:kern w:val="0"/>
+                <w:sz w:val="24"/>
+                <w:szCs w:val="24"/>
+                <w:lang w:val="ru-RU" w:eastAsia="ja-JP"/>
+                <w14:ligatures w14:val="none"/>
+              </w:rPr>
+              <w:t>7</w:t>
+            </w:r>
+          </w:p>
+        </w:tc>
+        <w:tc>
+          <w:tcPr>
+            <w:tcW w:w="0" w:type="auto"/>
+            <w:shd w:val="clear" w:color="auto" w:fill="auto"/>
+            <w:noWrap/>
+            <w:vAlign w:val="bottom"/>
+            <w:hideMark/>
+          </w:tcPr>
+          <w:p>
+            <w:pPr>
+              <w:spacing w:after="0" w:line="240" w:lineRule="auto"/>
+              <w:rPr>
+                <w:rFonts w:eastAsia="Times New Roman" w:cs="Times New Roman"/>
+                <w:color w:val="000000"/>
+                <w:kern w:val="0"/>
+                <w:sz w:val="24"/>
+                <w:szCs w:val="24"/>
+                <w:lang w:val="ru-RU" w:eastAsia="ja-JP"/>
+                <w14:ligatures w14:val="none"/>
+              </w:rPr>
+            </w:pPr>
+            <w:r>
+              <w:rPr>
+                <w:rFonts w:eastAsia="Times New Roman" w:cs="Times New Roman"/>
+                <w:color w:val="000000"/>
+                <w:kern w:val="0"/>
+                <w:sz w:val="24"/>
+                <w:szCs w:val="24"/>
+                <w:lang w:val="ru-RU" w:eastAsia="ja-JP"/>
+                <w14:ligatures w14:val="none"/>
+              </w:rPr>
+              <w:t>153</w:t>
+            </w:r>
+            <w:r>
+              <w:rPr>
+                <w:rFonts w:eastAsia="Times New Roman" w:cs="Times New Roman"/>
+                <w:color w:val="000000"/>
+                <w:kern w:val="0"/>
+                <w:sz w:val="24"/>
+                <w:szCs w:val="24"/>
+                <w:lang w:val="ru-RU" w:eastAsia="ja-JP"/>
+                <w14:ligatures w14:val="none"/>
+              </w:rPr>
+              <w:t>.44</w:t>
+            </w:r>
+            <w:r>
+              <w:rPr>
+                <w:rFonts w:eastAsia="Times New Roman" w:cs="Times New Roman"/>
+                <w:color w:val="000000"/>
+                <w:kern w:val="0"/>
+                <w:sz w:val="24"/>
+                <w:szCs w:val="24"/>
+                <w:lang w:val="ru-RU" w:eastAsia="ja-JP"/>
+                <w14:ligatures w14:val="none"/>
+              </w:rPr>
+              <w:t xml:space="preserve"> </w:t>
+            </w:r>
+            <w:proofErr w:type="spellStart"/>
+            <w:r>
+              <w:rPr>
+                <w:rFonts w:eastAsia="Times New Roman" w:cs="Times New Roman"/>
+                <w:color w:val="000000"/>
+                <w:kern w:val="0"/>
+                <w:sz w:val="24"/>
+                <w:szCs w:val="24"/>
+                <w:lang w:val="ru-RU" w:eastAsia="ja-JP"/>
+                <w14:ligatures w14:val="none"/>
+              </w:rPr>
+              <w:t>seconds</w:t>
+            </w:r>
+            <w:proofErr w:type="spellEnd"/>
+          </w:p>
+        </w:tc>
+      </w:tr>
+    </w:tbl>
+    <w:p>
+      <w:pPr>
+        <w:rPr>
+          <w:rFonts w:cstheme="majorBidi"/>
+          <w:sz w:val="24"/>
+          <w:szCs w:val="24"/>
+        </w:rPr>
+      </w:pPr>
+    </w:p>
+    <w:p>
+      <w:pPr>
+        <w:ind w:left="720"/>
+        <w:rPr>
+          <w:rFonts w:cstheme="majorBidi"/>
+          <w:sz w:val="24"/>
+          <w:szCs w:val="24"/>
+        </w:rPr>
+      </w:pPr>
+      <w:r>
+        <w:rPr>
+          <w:rFonts w:cstheme="majorBidi"/>
+          <w:noProof/>
+        </w:rPr>
+        <w:drawing>
+          <wp:anchor distT="0" distB="0" distL="114300" distR="114300" simplePos="0" relativeHeight="251672576" behindDoc="0" locked="0" layoutInCell="1" allowOverlap="1" wp14:anchorId="63CB452F" wp14:editId="0162760F">
+            <wp:simplePos x="0" y="0"/>
+            <wp:positionH relativeFrom="margin">
+              <wp:posOffset>-485775</wp:posOffset>
+            </wp:positionH>
+            <wp:positionV relativeFrom="paragraph">
+              <wp:posOffset>819150</wp:posOffset>
+            </wp:positionV>
+            <wp:extent cx="3328692" cy="3152775"/>
+            <wp:effectExtent l="0" t="0" r="5080" b="0"/>
+            <wp:wrapTopAndBottom/>
+            <wp:docPr id="180235521" name="Picture 1" descr="A graph of loss and validation&#10;&#10;AI-generated content may be incorrect."/>
+            <wp:cNvGraphicFramePr>
+              <a:graphicFrameLocks xmlns:a="http://schemas.openxmlformats.org/drawingml/2006/main" noChangeAspect="1"/>
+            </wp:cNvGraphicFramePr>
+            <a:graphic xmlns:a="http://schemas.openxmlformats.org/drawingml/2006/main">
+              <a:graphicData uri="http://schemas.openxmlformats.org/drawingml/2006/picture">
+                <pic:pic xmlns:pic="http://schemas.openxmlformats.org/drawingml/2006/picture">
+                  <pic:nvPicPr>
+                    <pic:cNvPr id="180235521" name="Picture 1" descr="A graph of loss and validation&#10;&#10;AI-generated content may be incorrect."/>
+                    <pic:cNvPicPr/>
+                  </pic:nvPicPr>
+                  <pic:blipFill>
+                    <a:blip r:embed="rId7">
+                      <a:extLst>
+                        <a:ext uri="{28A0092B-C50C-407E-A947-70E740481C1C}">
+                          <a14:useLocalDpi xmlns:a14="http://schemas.microsoft.com/office/drawing/2010/main" val="0"/>
+                        </a:ext>
+                      </a:extLst>
+                    </a:blip>
+                    <a:stretch>
+                      <a:fillRect/>
+                    </a:stretch>
+                  </pic:blipFill>
+                  <pic:spPr>
+                    <a:xfrm>
+                      <a:off x="0" y="0"/>
+                      <a:ext cx="3328692" cy="3152775"/>
+                    </a:xfrm>
+                    <a:prstGeom prst="rect">
+                      <a:avLst/>
+                    </a:prstGeom>
+                  </pic:spPr>
+                </pic:pic>
+              </a:graphicData>
+            </a:graphic>
+            <wp14:sizeRelH relativeFrom="margin">
+              <wp14:pctWidth>0</wp14:pctWidth>
+            </wp14:sizeRelH>
+            <wp14:sizeRelV relativeFrom="margin">
+              <wp14:pctHeight>0</wp14:pctHeight>
+            </wp14:sizeRelV>
+          </wp:anchor>
+        </w:drawing>
+      </w:r>
+      <w:r>
+        <w:rPr>
+          <w:rFonts w:cstheme="majorBidi"/>
+          <w:noProof/>
+        </w:rPr>
+        <w:drawing>
+          <wp:anchor distT="0" distB="0" distL="114300" distR="114300" simplePos="0" relativeHeight="251673600" behindDoc="0" locked="0" layoutInCell="1" allowOverlap="1" wp14:anchorId="6336FC68" wp14:editId="3E1C5B2B">
+            <wp:simplePos x="0" y="0"/>
+            <wp:positionH relativeFrom="column">
+              <wp:posOffset>3019425</wp:posOffset>
+            </wp:positionH>
+            <wp:positionV relativeFrom="paragraph">
+              <wp:posOffset>828675</wp:posOffset>
+            </wp:positionV>
+            <wp:extent cx="3314700" cy="3139440"/>
+            <wp:effectExtent l="0" t="0" r="0" b="3810"/>
+            <wp:wrapTopAndBottom/>
+            <wp:docPr id="897365084" name="Picture 1" descr="A graph with a line graph and text&#10;&#10;AI-generated content may be incorrect."/>
+            <wp:cNvGraphicFramePr>
+              <a:graphicFrameLocks xmlns:a="http://schemas.openxmlformats.org/drawingml/2006/main" noChangeAspect="1"/>
+            </wp:cNvGraphicFramePr>
+            <a:graphic xmlns:a="http://schemas.openxmlformats.org/drawingml/2006/main">
+              <a:graphicData uri="http://schemas.openxmlformats.org/drawingml/2006/picture">
+                <pic:pic xmlns:pic="http://schemas.openxmlformats.org/drawingml/2006/picture">
+                  <pic:nvPicPr>
+                    <pic:cNvPr id="448784309" name="Picture 1" descr="A graph with a line graph and text&#10;&#10;AI-generated content may be incorrect."/>
+                    <pic:cNvPicPr/>
+                  </pic:nvPicPr>
+                  <pic:blipFill>
+                    <a:blip r:embed="rId8">
+                      <a:extLst>
+                        <a:ext uri="{28A0092B-C50C-407E-A947-70E740481C1C}">
+                          <a14:useLocalDpi xmlns:a14="http://schemas.microsoft.com/office/drawing/2010/main" val="0"/>
+                        </a:ext>
+                      </a:extLst>
+                    </a:blip>
+                    <a:stretch>
+                      <a:fillRect/>
+                    </a:stretch>
+                  </pic:blipFill>
+                  <pic:spPr>
+                    <a:xfrm>
+                      <a:off x="0" y="0"/>
+                      <a:ext cx="3314700" cy="3139440"/>
+                    </a:xfrm>
+                    <a:prstGeom prst="rect">
+                      <a:avLst/>
+                    </a:prstGeom>
+                  </pic:spPr>
+                </pic:pic>
+              </a:graphicData>
+            </a:graphic>
+            <wp14:sizeRelH relativeFrom="margin">
+              <wp14:pctWidth>0</wp14:pctWidth>
+            </wp14:sizeRelH>
+            <wp14:sizeRelV relativeFrom="margin">
+              <wp14:pctHeight>0</wp14:pctHeight>
+            </wp14:sizeRelV>
+          </wp:anchor>
+        </w:drawing>
+      </w:r>
+      <w:r>
+        <w:rPr>
+          <w:rFonts w:cstheme="majorBidi"/>
+          <w:b/>
+          <w:bCs/>
+          <w:sz w:val="24"/>
+          <w:szCs w:val="24"/>
+        </w:rPr>
+        <w:t>Observation:</w:t>
+      </w:r>
+      <w:r>
+        <w:rPr>
+          <w:rFonts w:cstheme="majorBidi"/>
+          <w:sz w:val="24"/>
+          <w:szCs w:val="24"/>
+        </w:rPr>
+        <w:t xml:space="preserve"> </w:t>
+      </w:r>
+      <w:r>
+        <w:rPr>
+          <w:rFonts w:cstheme="majorBidi"/>
+          <w:sz w:val="24"/>
+          <w:szCs w:val="24"/>
+          <w:lang w:eastAsia="ja-JP"/>
+        </w:rPr>
+        <w:t xml:space="preserve">While the training accuracy improved, the validation and test </w:t>
+      </w:r>
+      <w:proofErr w:type="gramStart"/>
+      <w:r>
+        <w:rPr>
+          <w:rFonts w:cstheme="majorBidi"/>
+          <w:sz w:val="24"/>
+          <w:szCs w:val="24"/>
+          <w:lang w:eastAsia="ja-JP"/>
+        </w:rPr>
+        <w:t>accuracies</w:t>
+      </w:r>
+      <w:proofErr w:type="gramEnd"/>
+      <w:r>
+        <w:rPr>
+          <w:rFonts w:cstheme="majorBidi"/>
+          <w:sz w:val="24"/>
+          <w:szCs w:val="24"/>
+          <w:lang w:eastAsia="ja-JP"/>
+        </w:rPr>
+        <w:t xml:space="preserve"> declined significantly, suggesting overfitting. Additionally, training time increased due to the higher dimensional input. Given these drawbacks, we decided to revert to using grayscale images for </w:t>
+      </w:r>
+      <w:r>
+        <w:rPr>
+          <w:rFonts w:cstheme="majorBidi"/>
+          <w:sz w:val="24"/>
+          <w:szCs w:val="24"/>
+          <w:lang w:eastAsia="ja-JP"/>
+        </w:rPr>
+        <w:t>the next</w:t>
+      </w:r>
+      <w:r>
+        <w:rPr>
+          <w:rFonts w:cstheme="majorBidi"/>
+          <w:sz w:val="24"/>
+          <w:szCs w:val="24"/>
+          <w:lang w:eastAsia="ja-JP"/>
+        </w:rPr>
+        <w:t xml:space="preserve"> experiments.</w:t>
+      </w:r>
+    </w:p>
+    <w:p>
+      <w:pPr>
+        <w:pStyle w:val="ListParagraph"/>
+        <w:numPr>
+          <w:ilvl w:val="0"/>
+          <w:numId w:val="22"/>
+        </w:numPr>
+        <w:rPr>
+          <w:rFonts w:cstheme="majorBidi"/>
+          <w:b/>
+          <w:bCs/>
+          <w:sz w:val="24"/>
+          <w:szCs w:val="24"/>
+        </w:rPr>
+      </w:pPr>
+      <w:r>
+        <w:rPr>
+          <w:rFonts w:cstheme="majorBidi"/>
+          <w:b/>
+          <w:bCs/>
+          <w:sz w:val="24"/>
+          <w:szCs w:val="24"/>
+        </w:rPr>
+        <w:lastRenderedPageBreak/>
+        <w:t>Optimizer Change: SGD to Adam</w:t>
+      </w:r>
+    </w:p>
+    <w:p>
+      <w:pPr>
+        <w:pStyle w:val="NormalWeb"/>
+        <w:numPr>
+          <w:ilvl w:val="0"/>
+          <w:numId w:val="20"/>
+        </w:numPr>
+        <w:rPr>
+          <w:rFonts w:asciiTheme="minorHAnsi" w:hAnsiTheme="minorHAnsi"/>
+          <w:lang w:val="en-US"/>
+        </w:rPr>
+      </w:pPr>
+      <w:r>
+        <w:rPr>
+          <w:rStyle w:val="Strong"/>
+          <w:rFonts w:asciiTheme="minorHAnsi" w:eastAsiaTheme="majorEastAsia" w:hAnsiTheme="minorHAnsi"/>
+          <w:lang w:val="en-US"/>
+        </w:rPr>
+        <w:t>Rationale:</w:t>
+      </w:r>
+      <w:r>
+        <w:rPr>
+          <w:rFonts w:asciiTheme="minorHAnsi" w:hAnsiTheme="minorHAnsi"/>
+          <w:lang w:val="en-US"/>
+        </w:rPr>
+        <w:t xml:space="preserve"> </w:t>
+      </w:r>
+      <w:r>
+        <w:rPr>
+          <w:rFonts w:asciiTheme="minorHAnsi" w:eastAsiaTheme="minorEastAsia" w:hAnsiTheme="minorHAnsi"/>
+          <w:lang w:val="en-US"/>
+        </w:rPr>
+        <w:t xml:space="preserve">While SGD was popular at </w:t>
+      </w:r>
+      <w:r>
+        <w:rPr>
+          <w:rFonts w:asciiTheme="minorHAnsi" w:eastAsiaTheme="minorEastAsia" w:hAnsiTheme="minorHAnsi"/>
+          <w:lang w:val="en-US"/>
+        </w:rPr>
+        <w:t>the time</w:t>
+      </w:r>
+      <w:r>
+        <w:rPr>
+          <w:rFonts w:asciiTheme="minorHAnsi" w:eastAsiaTheme="minorEastAsia" w:hAnsiTheme="minorHAnsi"/>
+          <w:lang w:val="en-US"/>
+        </w:rPr>
+        <w:t xml:space="preserve"> the paper was publish</w:t>
+      </w:r>
+      <w:r>
+        <w:rPr>
+          <w:rFonts w:asciiTheme="minorHAnsi" w:eastAsiaTheme="minorEastAsia" w:hAnsiTheme="minorHAnsi" w:hint="eastAsia"/>
+          <w:lang w:val="en-US"/>
+        </w:rPr>
+        <w:t>ed</w:t>
+      </w:r>
+      <w:r>
+        <w:rPr>
+          <w:rFonts w:asciiTheme="minorHAnsi" w:eastAsiaTheme="minorEastAsia" w:hAnsiTheme="minorHAnsi"/>
+          <w:lang w:val="en-US"/>
+        </w:rPr>
+        <w:t xml:space="preserve">, currently </w:t>
+      </w:r>
+      <w:r>
+        <w:rPr>
+          <w:rFonts w:asciiTheme="minorHAnsi" w:hAnsiTheme="minorHAnsi"/>
+          <w:lang w:val="en-US"/>
+        </w:rPr>
+        <w:t>Adam is a widely used optimizer known for adaptive learning rates and often faster convergence compared to SGD</w:t>
+      </w:r>
+      <w:r>
+        <w:rPr>
+          <w:rFonts w:asciiTheme="minorHAnsi" w:eastAsiaTheme="minorEastAsia" w:hAnsiTheme="minorHAnsi"/>
+          <w:lang w:val="en-US"/>
+        </w:rPr>
+        <w:t>.</w:t>
+      </w:r>
+    </w:p>
+    <w:p>
+      <w:pPr>
+        <w:pStyle w:val="NormalWeb"/>
+        <w:numPr>
+          <w:ilvl w:val="0"/>
+          <w:numId w:val="20"/>
+        </w:numPr>
+        <w:rPr>
+          <w:rFonts w:asciiTheme="minorHAnsi" w:hAnsiTheme="minorHAnsi"/>
+          <w:lang w:val="en-US"/>
+        </w:rPr>
+      </w:pPr>
+      <w:r>
+        <w:rPr>
+          <w:rStyle w:val="Strong"/>
+          <w:rFonts w:asciiTheme="minorHAnsi" w:eastAsiaTheme="majorEastAsia" w:hAnsiTheme="minorHAnsi"/>
+          <w:lang w:val="en-US"/>
+        </w:rPr>
+        <w:t>Configuration:</w:t>
+      </w:r>
+      <w:r>
+        <w:rPr>
+          <w:rFonts w:asciiTheme="minorHAnsi" w:hAnsiTheme="minorHAnsi"/>
+          <w:lang w:val="en-US"/>
+        </w:rPr>
+        <w:t xml:space="preserve"> Replaced SGD with Adam optimizer, </w:t>
+      </w:r>
+      <w:r>
+        <w:rPr>
+          <w:rFonts w:asciiTheme="minorHAnsi" w:eastAsiaTheme="minorEastAsia" w:hAnsiTheme="minorHAnsi"/>
+          <w:lang w:val="en-US"/>
+        </w:rPr>
+        <w:t>reduced</w:t>
+      </w:r>
+      <w:r>
+        <w:rPr>
+          <w:rFonts w:asciiTheme="minorHAnsi" w:hAnsiTheme="minorHAnsi"/>
+          <w:lang w:val="en-US"/>
+        </w:rPr>
+        <w:t xml:space="preserve"> L</w:t>
+      </w:r>
+      <w:r>
+        <w:rPr>
+          <w:rFonts w:asciiTheme="minorHAnsi" w:eastAsiaTheme="minorEastAsia" w:hAnsiTheme="minorHAnsi"/>
+          <w:lang w:val="en-US"/>
+        </w:rPr>
+        <w:t xml:space="preserve">earning </w:t>
+      </w:r>
+      <w:r>
+        <w:rPr>
+          <w:rFonts w:asciiTheme="minorHAnsi" w:hAnsiTheme="minorHAnsi"/>
+          <w:lang w:val="en-US"/>
+        </w:rPr>
+        <w:t>R</w:t>
+      </w:r>
+      <w:r>
+        <w:rPr>
+          <w:rFonts w:asciiTheme="minorHAnsi" w:eastAsiaTheme="minorEastAsia" w:hAnsiTheme="minorHAnsi"/>
+          <w:lang w:val="en-US"/>
+        </w:rPr>
+        <w:t>ate to</w:t>
+      </w:r>
+      <w:r>
+        <w:rPr>
+          <w:rFonts w:asciiTheme="minorHAnsi" w:hAnsiTheme="minorHAnsi"/>
+          <w:lang w:val="en-US"/>
+        </w:rPr>
+        <w:t xml:space="preserve"> </w:t>
+      </w:r>
+      <m:oMath>
+        <m:sSup>
+          <m:sSupPr>
+            <m:ctrlPr>
+              <w:rPr>
+                <w:rFonts w:ascii="Cambria Math" w:eastAsiaTheme="minorEastAsia" w:hAnsi="Cambria Math"/>
+                <w:i/>
+                <w:lang w:val="en-US"/>
+              </w:rPr>
+            </m:ctrlPr>
+          </m:sSupPr>
+          <m:e>
+            <m:r>
+              <w:rPr>
+                <w:rFonts w:ascii="Cambria Math" w:hAnsi="Cambria Math"/>
+                <w:lang w:val="en-US"/>
+              </w:rPr>
+              <m:t>1</m:t>
+            </m:r>
+            <m:r>
+              <w:rPr>
+                <w:rFonts w:ascii="Cambria Math" w:eastAsiaTheme="minorEastAsia" w:hAnsi="Cambria Math"/>
+                <w:lang w:val="en-US"/>
+              </w:rPr>
+              <m:t>0</m:t>
+            </m:r>
+          </m:e>
+          <m:sup>
+            <m:r>
+              <w:rPr>
+                <w:rFonts w:ascii="Cambria Math" w:eastAsiaTheme="minorEastAsia" w:hAnsi="Cambria Math"/>
+                <w:lang w:val="en-US"/>
+              </w:rPr>
+              <m:t>-5</m:t>
+            </m:r>
+          </m:sup>
+        </m:sSup>
+      </m:oMath>
+      <w:r>
+        <w:rPr>
+          <w:rFonts w:asciiTheme="minorHAnsi" w:hAnsiTheme="minorHAnsi"/>
+          <w:lang w:val="en-US"/>
+        </w:rPr>
+        <w:t>. All other baseline parameters remained (</w:t>
+      </w:r>
+      <w:r>
+        <w:rPr>
+          <w:rFonts w:asciiTheme="minorHAnsi" w:hAnsiTheme="minorHAnsi"/>
+          <w:lang w:val="en-US"/>
+        </w:rPr>
+        <w:t>grayscale</w:t>
+      </w:r>
+      <w:r>
+        <w:rPr>
+          <w:rFonts w:asciiTheme="minorHAnsi" w:hAnsiTheme="minorHAnsi"/>
+          <w:lang w:val="en-US"/>
+        </w:rPr>
+        <w:t xml:space="preserve"> input, Embed Dim 4096, paper's weight </w:t>
+      </w:r>
+      <w:r>
+        <w:rPr>
+          <w:rFonts w:asciiTheme="minorHAnsi" w:hAnsiTheme="minorHAnsi"/>
+          <w:lang w:val="en-US"/>
+        </w:rPr>
+        <w:t>init</w:t>
+      </w:r>
+      <w:r>
+        <w:rPr>
+          <w:rFonts w:asciiTheme="minorHAnsi" w:hAnsiTheme="minorHAnsi"/>
+          <w:lang w:val="en-US"/>
+        </w:rPr>
+        <w:t>ialization</w:t>
+      </w:r>
+      <w:r>
+        <w:rPr>
+          <w:rFonts w:asciiTheme="minorHAnsi" w:hAnsiTheme="minorHAnsi"/>
+          <w:lang w:val="en-US"/>
+        </w:rPr>
+        <w:t>).</w:t>
+      </w:r>
+    </w:p>
+    <w:p>
+      <w:pPr>
+        <w:pStyle w:val="NormalWeb"/>
+        <w:numPr>
+          <w:ilvl w:val="0"/>
+          <w:numId w:val="20"/>
+        </w:numPr>
+        <w:rPr>
+          <w:rFonts w:asciiTheme="minorHAnsi" w:hAnsiTheme="minorHAnsi"/>
+          <w:lang w:val="en-US"/>
+        </w:rPr>
+      </w:pPr>
+      <w:r>
+        <w:rPr>
+          <w:rStyle w:val="Strong"/>
+          <w:rFonts w:asciiTheme="minorHAnsi" w:eastAsiaTheme="majorEastAsia" w:hAnsiTheme="minorHAnsi" w:hint="eastAsia"/>
+          <w:lang w:val="en-US"/>
+        </w:rPr>
+        <w:t>Results:</w:t>
+      </w:r>
+    </w:p>
+    <w:tbl>
+      <w:tblPr>
+        <w:tblW w:w="0" w:type="auto"/>
+        <w:tblInd w:w="582" w:type="dxa"/>
+        <w:tblBorders>
+          <w:top w:val="single" w:sz="4" w:space="0" w:color="auto"/>
+          <w:left w:val="single" w:sz="4" w:space="0" w:color="auto"/>
+          <w:bottom w:val="single" w:sz="4" w:space="0" w:color="auto"/>
+          <w:right w:val="single" w:sz="4" w:space="0" w:color="auto"/>
+          <w:insideH w:val="single" w:sz="4" w:space="0" w:color="auto"/>
+          <w:insideV w:val="single" w:sz="4" w:space="0" w:color="auto"/>
+        </w:tblBorders>
+        <w:tblLook w:val="04A0" w:firstRow="1" w:lastRow="0" w:firstColumn="1" w:lastColumn="0" w:noHBand="0" w:noVBand="1"/>
+      </w:tblPr>
+      <w:tblGrid>
+        <w:gridCol w:w="1035"/>
+        <w:gridCol w:w="1266"/>
+        <w:gridCol w:w="926"/>
+        <w:gridCol w:w="1035"/>
+        <w:gridCol w:w="1266"/>
+        <w:gridCol w:w="798"/>
+        <w:gridCol w:w="1860"/>
+      </w:tblGrid>
+      <w:tr>
+        <w:trPr>
+          <w:trHeight w:val="276"/>
+        </w:trPr>
+        <w:tc>
+          <w:tcPr>
+            <w:tcW w:w="0" w:type="auto"/>
+            <w:gridSpan w:val="3"/>
+            <w:shd w:val="clear" w:color="auto" w:fill="auto"/>
+            <w:noWrap/>
+            <w:vAlign w:val="bottom"/>
+            <w:hideMark/>
+          </w:tcPr>
+          <w:p>
+            <w:pPr>
+              <w:spacing w:after="0" w:line="240" w:lineRule="auto"/>
+              <w:jc w:val="center"/>
+              <w:rPr>
+                <w:rFonts w:eastAsia="Times New Roman" w:cs="Times New Roman"/>
+                <w:color w:val="000000"/>
+                <w:kern w:val="0"/>
+                <w:sz w:val="24"/>
+                <w:szCs w:val="24"/>
+                <w:lang w:val="ru-RU" w:eastAsia="ja-JP"/>
+                <w14:ligatures w14:val="none"/>
+              </w:rPr>
+            </w:pPr>
+            <w:proofErr w:type="spellStart"/>
+            <w:r>
+              <w:rPr>
+                <w:rFonts w:eastAsia="Times New Roman" w:cs="Times New Roman"/>
+                <w:color w:val="000000"/>
+                <w:kern w:val="0"/>
+                <w:sz w:val="24"/>
+                <w:szCs w:val="24"/>
+                <w:lang w:val="ru-RU" w:eastAsia="ja-JP"/>
+                <w14:ligatures w14:val="none"/>
+              </w:rPr>
+              <w:t>Loss</w:t>
+            </w:r>
+            <w:proofErr w:type="spellEnd"/>
+          </w:p>
+        </w:tc>
+        <w:tc>
+          <w:tcPr>
+            <w:tcW w:w="0" w:type="auto"/>
+            <w:gridSpan w:val="3"/>
+            <w:shd w:val="clear" w:color="auto" w:fill="auto"/>
+            <w:noWrap/>
+            <w:vAlign w:val="bottom"/>
+            <w:hideMark/>
+          </w:tcPr>
+          <w:p>
+            <w:pPr>
+              <w:spacing w:after="0" w:line="240" w:lineRule="auto"/>
+              <w:jc w:val="center"/>
+              <w:rPr>
+                <w:rFonts w:eastAsia="Times New Roman" w:cs="Times New Roman"/>
+                <w:color w:val="000000"/>
+                <w:kern w:val="0"/>
+                <w:sz w:val="24"/>
+                <w:szCs w:val="24"/>
+                <w:lang w:val="ru-RU" w:eastAsia="ja-JP"/>
+                <w14:ligatures w14:val="none"/>
+              </w:rPr>
+            </w:pPr>
+            <w:proofErr w:type="spellStart"/>
+            <w:r>
+              <w:rPr>
+                <w:rFonts w:eastAsia="Times New Roman" w:cs="Times New Roman"/>
+                <w:color w:val="000000"/>
+                <w:kern w:val="0"/>
+                <w:sz w:val="24"/>
+                <w:szCs w:val="24"/>
+                <w:lang w:val="ru-RU" w:eastAsia="ja-JP"/>
+                <w14:ligatures w14:val="none"/>
+              </w:rPr>
+              <w:t>Accuracy</w:t>
+            </w:r>
+            <w:proofErr w:type="spellEnd"/>
+          </w:p>
+        </w:tc>
+        <w:tc>
+          <w:tcPr>
+            <w:tcW w:w="0" w:type="auto"/>
+            <w:shd w:val="clear" w:color="auto" w:fill="auto"/>
+            <w:noWrap/>
+            <w:vAlign w:val="bottom"/>
+            <w:hideMark/>
+          </w:tcPr>
+          <w:p>
+            <w:pPr>
+              <w:spacing w:after="0" w:line="240" w:lineRule="auto"/>
+              <w:jc w:val="center"/>
+              <w:rPr>
+                <w:rFonts w:eastAsia="Times New Roman" w:cs="Times New Roman"/>
+                <w:color w:val="000000"/>
+                <w:kern w:val="0"/>
+                <w:sz w:val="24"/>
+                <w:szCs w:val="24"/>
+                <w:lang w:val="ru-RU" w:eastAsia="ja-JP"/>
+                <w14:ligatures w14:val="none"/>
+              </w:rPr>
+            </w:pPr>
+          </w:p>
+        </w:tc>
+      </w:tr>
+      <w:tr>
+        <w:trPr>
+          <w:trHeight w:val="276"/>
+        </w:trPr>
+        <w:tc>
+          <w:tcPr>
+            <w:tcW w:w="0" w:type="auto"/>
+            <w:shd w:val="clear" w:color="auto" w:fill="auto"/>
+            <w:noWrap/>
+            <w:vAlign w:val="bottom"/>
+            <w:hideMark/>
+          </w:tcPr>
+          <w:p>
+            <w:pPr>
+              <w:spacing w:after="0" w:line="240" w:lineRule="auto"/>
+              <w:rPr>
+                <w:rFonts w:eastAsia="Times New Roman" w:cs="Times New Roman"/>
+                <w:color w:val="000000"/>
+                <w:kern w:val="0"/>
+                <w:sz w:val="24"/>
+                <w:szCs w:val="24"/>
+                <w:lang w:val="ru-RU" w:eastAsia="ja-JP"/>
+                <w14:ligatures w14:val="none"/>
+              </w:rPr>
+            </w:pPr>
+            <w:proofErr w:type="spellStart"/>
+            <w:r>
+              <w:rPr>
+                <w:rFonts w:eastAsia="Times New Roman" w:cs="Times New Roman"/>
+                <w:color w:val="000000"/>
+                <w:kern w:val="0"/>
+                <w:sz w:val="24"/>
+                <w:szCs w:val="24"/>
+                <w:lang w:val="ru-RU" w:eastAsia="ja-JP"/>
+                <w14:ligatures w14:val="none"/>
+              </w:rPr>
+              <w:t>Training</w:t>
+            </w:r>
+            <w:proofErr w:type="spellEnd"/>
+          </w:p>
+        </w:tc>
+        <w:tc>
+          <w:tcPr>
+            <w:tcW w:w="0" w:type="auto"/>
+            <w:shd w:val="clear" w:color="auto" w:fill="auto"/>
+            <w:noWrap/>
+            <w:vAlign w:val="bottom"/>
+            <w:hideMark/>
+          </w:tcPr>
+          <w:p>
+            <w:pPr>
+              <w:spacing w:after="0" w:line="240" w:lineRule="auto"/>
+              <w:rPr>
+                <w:rFonts w:eastAsia="Times New Roman" w:cs="Times New Roman"/>
+                <w:color w:val="000000"/>
+                <w:kern w:val="0"/>
+                <w:sz w:val="24"/>
+                <w:szCs w:val="24"/>
+                <w:lang w:val="ru-RU" w:eastAsia="ja-JP"/>
+                <w14:ligatures w14:val="none"/>
+              </w:rPr>
+            </w:pPr>
+            <w:proofErr w:type="spellStart"/>
+            <w:r>
+              <w:rPr>
+                <w:rFonts w:eastAsia="Times New Roman" w:cs="Times New Roman"/>
+                <w:color w:val="000000"/>
+                <w:kern w:val="0"/>
+                <w:sz w:val="24"/>
+                <w:szCs w:val="24"/>
+                <w:lang w:val="ru-RU" w:eastAsia="ja-JP"/>
+                <w14:ligatures w14:val="none"/>
+              </w:rPr>
+              <w:t>Validation</w:t>
+            </w:r>
+            <w:proofErr w:type="spellEnd"/>
+          </w:p>
+        </w:tc>
+        <w:tc>
+          <w:tcPr>
+            <w:tcW w:w="0" w:type="auto"/>
+            <w:shd w:val="clear" w:color="auto" w:fill="auto"/>
+            <w:noWrap/>
+            <w:vAlign w:val="bottom"/>
+            <w:hideMark/>
+          </w:tcPr>
+          <w:p>
+            <w:pPr>
+              <w:spacing w:after="0" w:line="240" w:lineRule="auto"/>
+              <w:rPr>
+                <w:rFonts w:eastAsia="Times New Roman" w:cs="Times New Roman"/>
+                <w:color w:val="000000"/>
+                <w:kern w:val="0"/>
+                <w:sz w:val="24"/>
+                <w:szCs w:val="24"/>
+                <w:lang w:val="ru-RU" w:eastAsia="ja-JP"/>
+                <w14:ligatures w14:val="none"/>
+              </w:rPr>
+            </w:pPr>
+            <w:r>
+              <w:rPr>
+                <w:rFonts w:eastAsia="Times New Roman" w:cs="Times New Roman"/>
+                <w:color w:val="000000"/>
+                <w:kern w:val="0"/>
+                <w:sz w:val="24"/>
+                <w:szCs w:val="24"/>
+                <w:lang w:val="ru-RU" w:eastAsia="ja-JP"/>
+                <w14:ligatures w14:val="none"/>
+              </w:rPr>
+              <w:t>Test</w:t>
+            </w:r>
+          </w:p>
+        </w:tc>
+        <w:tc>
+          <w:tcPr>
+            <w:tcW w:w="0" w:type="auto"/>
+            <w:shd w:val="clear" w:color="auto" w:fill="auto"/>
+            <w:noWrap/>
+            <w:vAlign w:val="bottom"/>
+            <w:hideMark/>
+          </w:tcPr>
+          <w:p>
+            <w:pPr>
+              <w:spacing w:after="0" w:line="240" w:lineRule="auto"/>
+              <w:rPr>
+                <w:rFonts w:eastAsia="Times New Roman" w:cs="Times New Roman"/>
+                <w:color w:val="000000"/>
+                <w:kern w:val="0"/>
+                <w:sz w:val="24"/>
+                <w:szCs w:val="24"/>
+                <w:lang w:val="ru-RU" w:eastAsia="ja-JP"/>
+                <w14:ligatures w14:val="none"/>
+              </w:rPr>
+            </w:pPr>
+            <w:proofErr w:type="spellStart"/>
+            <w:r>
+              <w:rPr>
+                <w:rFonts w:eastAsia="Times New Roman" w:cs="Times New Roman"/>
+                <w:color w:val="000000"/>
+                <w:kern w:val="0"/>
+                <w:sz w:val="24"/>
+                <w:szCs w:val="24"/>
+                <w:lang w:val="ru-RU" w:eastAsia="ja-JP"/>
+                <w14:ligatures w14:val="none"/>
+              </w:rPr>
+              <w:t>Training</w:t>
+            </w:r>
+            <w:proofErr w:type="spellEnd"/>
+          </w:p>
+        </w:tc>
+        <w:tc>
+          <w:tcPr>
+            <w:tcW w:w="0" w:type="auto"/>
+            <w:shd w:val="clear" w:color="auto" w:fill="auto"/>
+            <w:noWrap/>
+            <w:vAlign w:val="bottom"/>
+            <w:hideMark/>
+          </w:tcPr>
+          <w:p>
+            <w:pPr>
+              <w:spacing w:after="0" w:line="240" w:lineRule="auto"/>
+              <w:rPr>
+                <w:rFonts w:eastAsia="Times New Roman" w:cs="Times New Roman"/>
+                <w:color w:val="000000"/>
+                <w:kern w:val="0"/>
+                <w:sz w:val="24"/>
+                <w:szCs w:val="24"/>
+                <w:lang w:val="ru-RU" w:eastAsia="ja-JP"/>
+                <w14:ligatures w14:val="none"/>
+              </w:rPr>
+            </w:pPr>
+            <w:proofErr w:type="spellStart"/>
+            <w:r>
+              <w:rPr>
+                <w:rFonts w:eastAsia="Times New Roman" w:cs="Times New Roman"/>
+                <w:color w:val="000000"/>
+                <w:kern w:val="0"/>
+                <w:sz w:val="24"/>
+                <w:szCs w:val="24"/>
+                <w:lang w:val="ru-RU" w:eastAsia="ja-JP"/>
+                <w14:ligatures w14:val="none"/>
+              </w:rPr>
+              <w:t>Validation</w:t>
+            </w:r>
+            <w:proofErr w:type="spellEnd"/>
+          </w:p>
+        </w:tc>
+        <w:tc>
+          <w:tcPr>
+            <w:tcW w:w="0" w:type="auto"/>
+            <w:shd w:val="clear" w:color="auto" w:fill="auto"/>
+            <w:noWrap/>
+            <w:vAlign w:val="bottom"/>
+            <w:hideMark/>
+          </w:tcPr>
+          <w:p>
+            <w:pPr>
+              <w:spacing w:after="0" w:line="240" w:lineRule="auto"/>
+              <w:rPr>
+                <w:rFonts w:eastAsia="Times New Roman" w:cs="Times New Roman"/>
+                <w:color w:val="000000"/>
+                <w:kern w:val="0"/>
+                <w:sz w:val="24"/>
+                <w:szCs w:val="24"/>
+                <w:lang w:val="ru-RU" w:eastAsia="ja-JP"/>
+                <w14:ligatures w14:val="none"/>
+              </w:rPr>
+            </w:pPr>
+            <w:r>
+              <w:rPr>
+                <w:rFonts w:eastAsia="Times New Roman" w:cs="Times New Roman"/>
+                <w:color w:val="000000"/>
+                <w:kern w:val="0"/>
+                <w:sz w:val="24"/>
+                <w:szCs w:val="24"/>
+                <w:lang w:val="ru-RU" w:eastAsia="ja-JP"/>
+                <w14:ligatures w14:val="none"/>
+              </w:rPr>
+              <w:t>Test</w:t>
+            </w:r>
+          </w:p>
+        </w:tc>
+        <w:tc>
+          <w:tcPr>
+            <w:tcW w:w="0" w:type="auto"/>
+            <w:shd w:val="clear" w:color="auto" w:fill="auto"/>
+            <w:noWrap/>
+            <w:vAlign w:val="bottom"/>
+            <w:hideMark/>
+          </w:tcPr>
+          <w:p>
+            <w:pPr>
+              <w:spacing w:after="0" w:line="240" w:lineRule="auto"/>
+              <w:rPr>
+                <w:rFonts w:eastAsia="Times New Roman" w:cs="Times New Roman"/>
+                <w:color w:val="000000"/>
+                <w:kern w:val="0"/>
+                <w:sz w:val="24"/>
+                <w:szCs w:val="24"/>
+                <w:lang w:val="ru-RU" w:eastAsia="ja-JP"/>
+                <w14:ligatures w14:val="none"/>
+              </w:rPr>
+            </w:pPr>
+            <w:proofErr w:type="spellStart"/>
+            <w:r>
+              <w:rPr>
+                <w:rFonts w:eastAsia="Times New Roman" w:cs="Times New Roman"/>
+                <w:color w:val="000000"/>
+                <w:kern w:val="0"/>
+                <w:sz w:val="24"/>
+                <w:szCs w:val="24"/>
+                <w:lang w:val="ru-RU" w:eastAsia="ja-JP"/>
+                <w14:ligatures w14:val="none"/>
+              </w:rPr>
+              <w:t>Training</w:t>
+            </w:r>
+            <w:proofErr w:type="spellEnd"/>
+            <w:r>
+              <w:rPr>
+                <w:rFonts w:eastAsia="Times New Roman" w:cs="Times New Roman"/>
+                <w:color w:val="000000"/>
+                <w:kern w:val="0"/>
+                <w:sz w:val="24"/>
+                <w:szCs w:val="24"/>
+                <w:lang w:val="ru-RU" w:eastAsia="ja-JP"/>
+                <w14:ligatures w14:val="none"/>
+              </w:rPr>
+              <w:t xml:space="preserve"> Time</w:t>
+            </w:r>
+          </w:p>
+        </w:tc>
+      </w:tr>
+      <w:tr>
+        <w:trPr>
+          <w:trHeight w:val="276"/>
+        </w:trPr>
+        <w:tc>
+          <w:tcPr>
+            <w:tcW w:w="0" w:type="auto"/>
+            <w:shd w:val="clear" w:color="auto" w:fill="auto"/>
+            <w:noWrap/>
+            <w:vAlign w:val="bottom"/>
+            <w:hideMark/>
+          </w:tcPr>
+          <w:p>
+            <w:pPr>
+              <w:spacing w:after="0" w:line="240" w:lineRule="auto"/>
+              <w:jc w:val="right"/>
+              <w:rPr>
+                <w:rFonts w:eastAsia="Times New Roman" w:cs="Times New Roman"/>
+                <w:color w:val="000000"/>
+                <w:kern w:val="0"/>
+                <w:sz w:val="24"/>
+                <w:szCs w:val="24"/>
+                <w:lang w:val="ru-RU" w:eastAsia="ja-JP"/>
+                <w14:ligatures w14:val="none"/>
+              </w:rPr>
+            </w:pPr>
+            <w:r>
+              <w:rPr>
+                <w:rFonts w:eastAsia="Times New Roman" w:cs="Times New Roman"/>
+                <w:color w:val="000000"/>
+                <w:kern w:val="0"/>
+                <w:sz w:val="24"/>
+                <w:szCs w:val="24"/>
+                <w:lang w:val="ru-RU" w:eastAsia="ja-JP"/>
+                <w14:ligatures w14:val="none"/>
+              </w:rPr>
               <w:t>0.1185</w:t>
             </w:r>
           </w:p>
@@ -4602,8 +6018,22 @@
                 <w:lang w:val="ru-RU" w:eastAsia="ja-JP"/>
                 <w14:ligatures w14:val="none"/>
               </w:rPr>
-              <w:t xml:space="preserve"> seconds</w:t>
+              <w:t xml:space="preserve"> </w:t>
             </w:r>
+            <w:proofErr w:type="spellStart"/>
+            <w:r>
+              <w:rPr>
+                <w:rFonts w:eastAsia="Times New Roman" w:cs="Times New Roman"/>
+                <w:color w:val="000000"/>
+                <w:kern w:val="0"/>
+                <w:sz w:val="24"/>
+                <w:szCs w:val="24"/>
+                <w:lang w:val="ru-RU" w:eastAsia="ja-JP"/>
+                <w14:ligatures w14:val="none"/>
+              </w:rPr>
+              <w:t>seconds</w:t>
+            </w:r>
+            <w:proofErr w:type="spellEnd"/>
           </w:p>
         </w:tc>
       </w:tr>
@@ -4842,7 +6272,21 @@
           <w:rFonts w:asciiTheme="minorHAnsi" w:hAnsiTheme="minorHAnsi"/>
           <w:lang w:val="en-US"/>
         </w:rPr>
-        <w:t xml:space="preserve">), kept RGB input and paper's weight </w:t>
+        <w:t xml:space="preserve">), </w:t>
+      </w:r>
+      <w:r>
+        <w:rPr>
+          <w:rFonts w:asciiTheme="minorHAnsi" w:hAnsiTheme="minorHAnsi"/>
+          <w:lang w:val="en-US"/>
+        </w:rPr>
+        <w:t xml:space="preserve">grayscale input </w:t>
+      </w:r>
+      <w:r>
+        <w:rPr>
+          <w:rFonts w:asciiTheme="minorHAnsi" w:hAnsiTheme="minorHAnsi"/>
+          <w:lang w:val="en-US"/>
+        </w:rPr>
+        <w:t xml:space="preserve">and paper's weight </w:t>
       </w:r>
       <w:r>
         <w:rPr>
@@ -4935,6 +6379,7 @@
                 <w14:ligatures w14:val="none"/>
               </w:rPr>
             </w:pPr>
+            <w:proofErr w:type="spellStart"/>
             <w:r>
               <w:rPr>
                 <w:rFonts w:ascii="Aptos Narrow" w:eastAsia="Times New Roman" w:hAnsi="Aptos Narrow" w:cs="Times New Roman"/>
@@ -4945,6 +6390,7 @@
               </w:rPr>
               <w:t>Loss</w:t>
             </w:r>
+            <w:proofErr w:type="spellEnd"/>
           </w:p>
         </w:tc>
         <w:tc>
@@ -4968,6 +6414,7 @@
                 <w14:ligatures w14:val="none"/>
               </w:rPr>
             </w:pPr>
+            <w:proofErr w:type="spellStart"/>
             <w:r>
               <w:rPr>
                 <w:rFonts w:ascii="Aptos Narrow" w:eastAsia="Times New Roman" w:hAnsi="Aptos Narrow" w:cs="Times New Roman"/>
@@ -4978,6 +6425,7 @@
               </w:rPr>
               <w:t>Accuracy</w:t>
             </w:r>
+            <w:proofErr w:type="spellEnd"/>
           </w:p>
         </w:tc>
         <w:tc>
@@ -5026,6 +6474,7 @@
                 <w14:ligatures w14:val="none"/>
               </w:rPr>
             </w:pPr>
+            <w:proofErr w:type="spellStart"/>
             <w:r>
               <w:rPr>
                 <w:rFonts w:ascii="Aptos Narrow" w:eastAsia="Times New Roman" w:hAnsi="Aptos Narrow" w:cs="Times New Roman"/>
@@ -5036,6 +6485,7 @@
               </w:rPr>
               <w:t>Training</w:t>
             </w:r>
+            <w:proofErr w:type="spellEnd"/>
           </w:p>
         </w:tc>
         <w:tc>
@@ -5057,6 +6507,7 @@
                 <w14:ligatures w14:val="none"/>
               </w:rPr>
             </w:pPr>
+            <w:proofErr w:type="spellStart"/>
             <w:r>
               <w:rPr>
                 <w:rFonts w:ascii="Aptos Narrow" w:eastAsia="Times New Roman" w:hAnsi="Aptos Narrow" w:cs="Times New Roman"/>
@@ -5067,6 +6518,7 @@
               </w:rPr>
               <w:t>Validation</w:t>
             </w:r>
+            <w:proofErr w:type="spellEnd"/>
           </w:p>
         </w:tc>
         <w:tc>
@@ -5119,6 +6571,7 @@
                 <w14:ligatures w14:val="none"/>
               </w:rPr>
             </w:pPr>
+            <w:proofErr w:type="spellStart"/>
             <w:r>
               <w:rPr>
                 <w:rFonts w:ascii="Aptos Narrow" w:eastAsia="Times New Roman" w:hAnsi="Aptos Narrow" w:cs="Times New Roman"/>
@@ -5129,6 +6582,7 @@
               </w:rPr>
               <w:t>Training</w:t>
             </w:r>
+            <w:proofErr w:type="spellEnd"/>
           </w:p>
         </w:tc>
         <w:tc>
@@ -5150,6 +6604,7 @@
                 <w14:ligatures w14:val="none"/>
               </w:rPr>
             </w:pPr>
+            <w:proofErr w:type="spellStart"/>
             <w:r>
               <w:rPr>
                 <w:rFonts w:ascii="Aptos Narrow" w:eastAsia="Times New Roman" w:hAnsi="Aptos Narrow" w:cs="Times New Roman"/>
@@ -5160,6 +6615,7 @@
               </w:rPr>
               <w:t>Validation</w:t>
             </w:r>
+            <w:proofErr w:type="spellEnd"/>
           </w:p>
         </w:tc>
         <w:tc>
@@ -5212,6 +6668,7 @@
                 <w14:ligatures w14:val="none"/>
               </w:rPr>
             </w:pPr>
+            <w:proofErr w:type="spellStart"/>
             <w:r>
               <w:rPr>
                 <w:rFonts w:ascii="Aptos Narrow" w:eastAsia="Times New Roman" w:hAnsi="Aptos Narrow" w:cs="Times New Roman"/>
@@ -5220,7 +6677,18 @@
                 <w:lang w:val="ru-RU" w:eastAsia="ja-JP"/>
                 <w14:ligatures w14:val="none"/>
               </w:rPr>
-              <w:t>Training Time</w:t>
+              <w:t>Training</w:t>
+            </w:r>
+            <w:proofErr w:type="spellEnd"/>
+            <w:r>
+              <w:rPr>
+                <w:rFonts w:ascii="Aptos Narrow" w:eastAsia="Times New Roman" w:hAnsi="Aptos Narrow" w:cs="Times New Roman"/>
+                <w:color w:val="000000"/>
+                <w:kern w:val="0"/>
+                <w:lang w:val="ru-RU" w:eastAsia="ja-JP"/>
+                <w14:ligatures w14:val="none"/>
+              </w:rPr>
+              <w:t xml:space="preserve"> Time</w:t>
             </w:r>
           </w:p>
         </w:tc>
@@ -5518,8 +6986,20 @@
                 <w:lang w:val="ru-RU" w:eastAsia="ja-JP"/>
                 <w14:ligatures w14:val="none"/>
               </w:rPr>
-              <w:t xml:space="preserve"> seconds</w:t>
+              <w:t xml:space="preserve"> </w:t>
             </w:r>
+            <w:proofErr w:type="spellStart"/>
+            <w:r>
+              <w:rPr>
+                <w:rFonts w:ascii="Aptos Narrow" w:eastAsia="Times New Roman" w:hAnsi="Aptos Narrow" w:cs="Times New Roman"/>
+                <w:color w:val="000000"/>
+                <w:kern w:val="0"/>
+                <w:lang w:val="ru-RU" w:eastAsia="ja-JP"/>
+                <w14:ligatures w14:val="none"/>
+              </w:rPr>
+              <w:t>seconds</w:t>
+            </w:r>
+            <w:proofErr w:type="spellEnd"/>
           </w:p>
         </w:tc>
       </w:tr>
@@ -5643,6 +7123,36 @@
         </w:rPr>
         <w:t>, we have decided to return to EMBEDDING_DIM 4096, since it yielded better results.</w:t>
       </w:r>
+    </w:p>
+    <w:p>
+      <w:pPr>
+        <w:ind w:left="360"/>
+        <w:rPr>
+          <w:rFonts w:cstheme="majorBidi"/>
+          <w:sz w:val="24"/>
+          <w:szCs w:val="24"/>
+        </w:rPr>
+      </w:pPr>
+    </w:p>
+    <w:p>
+      <w:pPr>
+        <w:ind w:left="360"/>
+        <w:rPr>
+          <w:rFonts w:cstheme="majorBidi"/>
+          <w:sz w:val="24"/>
+          <w:szCs w:val="24"/>
+        </w:rPr>
+      </w:pPr>
+    </w:p>
+    <w:p>
+      <w:pPr>
+        <w:ind w:left="360"/>
+        <w:rPr>
+          <w:rFonts w:cstheme="majorBidi"/>
+          <w:sz w:val="24"/>
+          <w:szCs w:val="24"/>
+        </w:rPr>
+      </w:pPr>
     </w:p>
     <w:p>
       <w:pPr>
@@ -5918,12 +7428,21 @@
           <w:rFonts w:asciiTheme="minorHAnsi" w:hAnsiTheme="minorHAnsi"/>
         </w:rPr>
       </w:pPr>
+      <w:proofErr w:type="spellStart"/>
       <w:r>
         <w:rPr>
           <w:rStyle w:val="Strong"/>
           <w:rFonts w:asciiTheme="minorHAnsi" w:eastAsiaTheme="majorEastAsia" w:hAnsiTheme="minorHAnsi"/>
         </w:rPr>
-        <w:t>Results:</w:t>
+        <w:t>Results</w:t>
+      </w:r>
+      <w:proofErr w:type="spellEnd"/>
+      <w:r>
+        <w:rPr>
+          <w:rStyle w:val="Strong"/>
+          <w:rFonts w:asciiTheme="minorHAnsi" w:eastAsiaTheme="majorEastAsia" w:hAnsiTheme="minorHAnsi"/>
+        </w:rPr>
+        <w:t>:</w:t>
       </w:r>
     </w:p>
     <w:tbl>
@@ -6657,7 +8176,7 @@
                     <pic:cNvPicPr/>
                   </pic:nvPicPr>
                   <pic:blipFill>
-                    <a:blip r:embed="rId7">
+                    <a:blip r:embed="rId9">
                       <a:extLst>
                         <a:ext uri="{28A0092B-C50C-407E-A947-70E740481C1C}">
                           <a14:useLocalDpi xmlns:a14="http://schemas.microsoft.com/office/drawing/2010/main" val="0"/>
@@ -6722,7 +8241,7 @@
                     <pic:cNvPicPr/>
                   </pic:nvPicPr>
                   <pic:blipFill>
-                    <a:blip r:embed="rId8">
+                    <a:blip r:embed="rId10">
                       <a:extLst>
                         <a:ext uri="{28A0092B-C50C-407E-A947-70E740481C1C}">
                           <a14:useLocalDpi xmlns:a14="http://schemas.microsoft.com/office/drawing/2010/main" val="0"/>
@@ -7174,7 +8693,7 @@
                     <pic:cNvPicPr/>
                   </pic:nvPicPr>
                   <pic:blipFill>
-                    <a:blip r:embed="rId9">
+                    <a:blip r:embed="rId11">
                       <a:extLst>
                         <a:ext uri="{28A0092B-C50C-407E-A947-70E740481C1C}">
                           <a14:useLocalDpi xmlns:a14="http://schemas.microsoft.com/office/drawing/2010/main" val="0"/>
@@ -7943,7 +9462,7 @@
                     <pic:cNvPicPr/>
                   </pic:nvPicPr>
                   <pic:blipFill>
-                    <a:blip r:embed="rId10">
+                    <a:blip r:embed="rId12">
                       <a:extLst>
                         <a:ext uri="{28A0092B-C50C-407E-A947-70E740481C1C}">
                           <a14:useLocalDpi xmlns:a14="http://schemas.microsoft.com/office/drawing/2010/main" val="0"/>
@@ -8338,6 +9857,7 @@
                 <w14:ligatures w14:val="none"/>
               </w:rPr>
             </w:pPr>
+            <w:proofErr w:type="spellStart"/>
             <w:r>
               <w:rPr>
                 <w:rFonts w:eastAsia="Times New Roman" w:cs="Times New Roman"/>
@@ -8350,6 +9870,7 @@
               </w:rPr>
               <w:t>Loss</w:t>
             </w:r>
+            <w:proofErr w:type="spellEnd"/>
           </w:p>
         </w:tc>
         <w:tc>
@@ -8375,6 +9896,7 @@
                 <w14:ligatures w14:val="none"/>
               </w:rPr>
             </w:pPr>
+            <w:proofErr w:type="spellStart"/>
             <w:r>
               <w:rPr>
                 <w:rFonts w:eastAsia="Times New Roman" w:cs="Times New Roman"/>
@@ -8387,6 +9909,7 @@
               </w:rPr>
               <w:t>Accuracy</w:t>
             </w:r>
+            <w:proofErr w:type="spellEnd"/>
           </w:p>
         </w:tc>
         <w:tc>
@@ -8439,6 +9962,7 @@
                 <w14:ligatures w14:val="none"/>
               </w:rPr>
             </w:pPr>
+            <w:proofErr w:type="spellStart"/>
             <w:r>
               <w:rPr>
                 <w:rFonts w:eastAsia="Times New Roman" w:cs="Times New Roman"/>
@@ -8451,6 +9975,7 @@
               </w:rPr>
               <w:t>Training</w:t>
             </w:r>
+            <w:proofErr w:type="spellEnd"/>
           </w:p>
         </w:tc>
         <w:tc>
@@ -8474,6 +9999,7 @@
                 <w14:ligatures w14:val="none"/>
               </w:rPr>
             </w:pPr>
+            <w:proofErr w:type="spellStart"/>
             <w:r>
               <w:rPr>
                 <w:rFonts w:eastAsia="Times New Roman" w:cs="Times New Roman"/>
@@ -8486,6 +10012,7 @@
               </w:rPr>
               <w:t>Validation</w:t>
             </w:r>
+            <w:proofErr w:type="spellEnd"/>
           </w:p>
         </w:tc>
         <w:tc>
@@ -8544,6 +10071,7 @@
                 <w14:ligatures w14:val="none"/>
               </w:rPr>
             </w:pPr>
+            <w:proofErr w:type="spellStart"/>
             <w:r>
               <w:rPr>
                 <w:rFonts w:eastAsia="Times New Roman" w:cs="Times New Roman"/>
@@ -8556,6 +10084,7 @@
               </w:rPr>
               <w:t>Training</w:t>
             </w:r>
+            <w:proofErr w:type="spellEnd"/>
           </w:p>
         </w:tc>
         <w:tc>
@@ -8579,6 +10108,7 @@
                 <w14:ligatures w14:val="none"/>
               </w:rPr>
             </w:pPr>
+            <w:proofErr w:type="spellStart"/>
             <w:r>
               <w:rPr>
                 <w:rFonts w:eastAsia="Times New Roman" w:cs="Times New Roman"/>
@@ -8591,6 +10121,7 @@
               </w:rPr>
               <w:t>Validation</w:t>
             </w:r>
+            <w:proofErr w:type="spellEnd"/>
           </w:p>
         </w:tc>
         <w:tc>
@@ -8649,6 +10180,7 @@
                 <w14:ligatures w14:val="none"/>
               </w:rPr>
             </w:pPr>
+            <w:proofErr w:type="spellStart"/>
             <w:r>
               <w:rPr>
                 <w:rFonts w:eastAsia="Times New Roman" w:cs="Times New Roman"/>
@@ -8659,7 +10191,20 @@
                 <w:lang w:val="ru-RU" w:eastAsia="ja-JP"/>
                 <w14:ligatures w14:val="none"/>
               </w:rPr>
-              <w:t>Training Time</w:t>
+              <w:t>Training</w:t>
+            </w:r>
+            <w:proofErr w:type="spellEnd"/>
+            <w:r>
+              <w:rPr>
+                <w:rFonts w:eastAsia="Times New Roman" w:cs="Times New Roman"/>
+                <w:color w:val="000000"/>
+                <w:kern w:val="0"/>
+                <w:sz w:val="24"/>
+                <w:szCs w:val="24"/>
+                <w:lang w:val="ru-RU" w:eastAsia="ja-JP"/>
+                <w14:ligatures w14:val="none"/>
+              </w:rPr>
+              <w:t xml:space="preserve"> Time</w:t>
             </w:r>
           </w:p>
         </w:tc>
@@ -8987,7 +10532,20 @@
                 <w:lang w:val="ru-RU" w:eastAsia="ja-JP"/>
                 <w14:ligatures w14:val="none"/>
               </w:rPr>
-              <w:t xml:space="preserve"> sec</w:t>
+              <w:t xml:space="preserve"> </w:t>
+            </w:r>
+            <w:proofErr w:type="spellStart"/>
+            <w:r>
+              <w:rPr>
+                <w:rFonts w:eastAsia="Times New Roman" w:cs="Times New Roman"/>
+                <w:color w:val="000000"/>
+                <w:kern w:val="0"/>
+                <w:sz w:val="24"/>
+                <w:szCs w:val="24"/>
+                <w:lang w:val="ru-RU" w:eastAsia="ja-JP"/>
+                <w14:ligatures w14:val="none"/>
+              </w:rPr>
+              <w:t>sec</w:t>
             </w:r>
             <w:r>
               <w:rPr>
@@ -9001,6 +10559,7 @@
               </w:rPr>
               <w:t>onds</w:t>
             </w:r>
+            <w:proofErr w:type="spellEnd"/>
           </w:p>
         </w:tc>
       </w:tr>
@@ -9094,7 +10653,7 @@
                     <pic:cNvPicPr/>
                   </pic:nvPicPr>
                   <pic:blipFill>
-                    <a:blip r:embed="rId11">
+                    <a:blip r:embed="rId13">
                       <a:extLst>
                         <a:ext uri="{28A0092B-C50C-407E-A947-70E740481C1C}">
                           <a14:useLocalDpi xmlns:a14="http://schemas.microsoft.com/office/drawing/2010/main" val="0"/>
@@ -9157,7 +10716,7 @@
                     <pic:cNvPicPr/>
                   </pic:nvPicPr>
                   <pic:blipFill>
-                    <a:blip r:embed="rId12">
+                    <a:blip r:embed="rId14">
                       <a:extLst>
                         <a:ext uri="{28A0092B-C50C-407E-A947-70E740481C1C}">
                           <a14:useLocalDpi xmlns:a14="http://schemas.microsoft.com/office/drawing/2010/main" val="0"/>
@@ -9436,303 +10995,6 @@
                     <pic:cNvPicPr/>
                   </pic:nvPicPr>
                   <pic:blipFill>
-                    <a:blip r:embed="rId13"/>
-                    <a:stretch>
-                      <a:fillRect/>
-                    </a:stretch>
-                  </pic:blipFill>
-                  <pic:spPr>
-                    <a:xfrm>
-                      <a:off x="0" y="0"/>
-                      <a:ext cx="4733925" cy="2762250"/>
-                    </a:xfrm>
-                    <a:prstGeom prst="rect">
-                      <a:avLst/>
-                    </a:prstGeom>
-                  </pic:spPr>
-                </pic:pic>
-              </a:graphicData>
-            </a:graphic>
-          </wp:inline>
-        </w:drawing>
-      </w:r>
-    </w:p>
-    <w:p>
-      <w:pPr>
-        <w:pStyle w:val="ListParagraph"/>
-        <w:numPr>
-          <w:ilvl w:val="0"/>
-          <w:numId w:val="31"/>
-        </w:numPr>
-        <w:rPr>
-          <w:b/>
-          <w:bCs/>
-          <w:noProof/>
-          <w:lang w:eastAsia="ja-JP"/>
-        </w:rPr>
-      </w:pPr>
-      <w:r>
-        <w:rPr>
-          <w:b/>
-          <w:bCs/>
-          <w:noProof/>
-          <w:lang w:eastAsia="ja-JP"/>
-        </w:rPr>
-        <w:t>Least Certain TP (Score ~ 0.5):</w:t>
-      </w:r>
-      <w:r>
-        <w:rPr>
-          <w:noProof/>
-          <w:lang w:eastAsia="ja-JP"/>
-        </w:rPr>
-        <w:t xml:space="preserve"> </w:t>
-      </w:r>
-      <w:r>
-        <w:rPr>
-          <w:noProof/>
-          <w:lang w:eastAsia="ja-JP"/>
-        </w:rPr>
-        <w:t xml:space="preserve">Different </w:t>
-      </w:r>
-      <w:r>
-        <w:rPr>
-          <w:rFonts w:hint="eastAsia"/>
-          <w:noProof/>
-          <w:lang w:eastAsia="ja-JP"/>
-        </w:rPr>
-        <w:t xml:space="preserve">looking </w:t>
-      </w:r>
-      <w:r>
-        <w:rPr>
-          <w:noProof/>
-          <w:lang w:eastAsia="ja-JP"/>
-        </w:rPr>
-        <w:t xml:space="preserve">glasses made this </w:t>
-      </w:r>
-      <w:r>
-        <w:rPr>
-          <w:rFonts w:hint="eastAsia"/>
-          <w:noProof/>
-          <w:lang w:eastAsia="ja-JP"/>
-        </w:rPr>
-        <w:t>challenging</w:t>
-      </w:r>
-      <w:r>
-        <w:rPr>
-          <w:noProof/>
-          <w:lang w:eastAsia="ja-JP"/>
-        </w:rPr>
-        <w:t>,</w:t>
-      </w:r>
-      <w:r>
-        <w:rPr>
-          <w:rFonts w:hint="eastAsia"/>
-          <w:noProof/>
-          <w:lang w:eastAsia="ja-JP"/>
-        </w:rPr>
-        <w:t xml:space="preserve"> but</w:t>
-      </w:r>
-      <w:r>
-        <w:rPr>
-          <w:noProof/>
-          <w:lang w:eastAsia="ja-JP"/>
-        </w:rPr>
-        <w:t xml:space="preserve"> </w:t>
-      </w:r>
-      <w:r>
-        <w:rPr>
-          <w:rFonts w:hint="eastAsia"/>
-          <w:noProof/>
-          <w:lang w:eastAsia="ja-JP"/>
-        </w:rPr>
-        <w:t>t</w:t>
-      </w:r>
-      <w:r>
-        <w:rPr>
-          <w:noProof/>
-          <w:lang w:eastAsia="ja-JP"/>
-        </w:rPr>
-        <w:t>he model correctly predicted</w:t>
-      </w:r>
-      <w:r>
-        <w:rPr>
-          <w:rFonts w:hint="eastAsia"/>
-          <w:noProof/>
-          <w:lang w:eastAsia="ja-JP"/>
-        </w:rPr>
-        <w:t xml:space="preserve"> it </w:t>
-      </w:r>
-      <w:r>
-        <w:rPr>
-          <w:noProof/>
-          <w:lang w:eastAsia="ja-JP"/>
-        </w:rPr>
-        <w:t>with low certainty, likely relying on other consistent features</w:t>
-      </w:r>
-      <w:r>
-        <w:rPr>
-          <w:rFonts w:hint="eastAsia"/>
-          <w:noProof/>
-          <w:lang w:eastAsia="ja-JP"/>
-        </w:rPr>
-        <w:t xml:space="preserve"> (headphones)</w:t>
-      </w:r>
-      <w:r>
-        <w:rPr>
-          <w:noProof/>
-          <w:lang w:eastAsia="ja-JP"/>
-        </w:rPr>
-        <w:t>.</w:t>
-      </w:r>
-      <w:r>
-        <w:rPr>
-          <w:b/>
-          <w:bCs/>
-          <w:noProof/>
-          <w:lang w:eastAsia="ja-JP"/>
-        </w:rPr>
-        <w:drawing>
-          <wp:inline distT="0" distB="0" distL="0" distR="0" wp14:anchorId="6FF04D72" wp14:editId="70D8003A">
-            <wp:extent cx="4733925" cy="2762250"/>
-            <wp:effectExtent l="0" t="0" r="9525" b="0"/>
-            <wp:docPr id="85425749" name="Picture 1"/>
-            <wp:cNvGraphicFramePr>
-              <a:graphicFrameLocks xmlns:a="http://schemas.openxmlformats.org/drawingml/2006/main" noChangeAspect="1"/>
-            </wp:cNvGraphicFramePr>
-            <a:graphic xmlns:a="http://schemas.openxmlformats.org/drawingml/2006/main">
-              <a:graphicData uri="http://schemas.openxmlformats.org/drawingml/2006/picture">
-                <pic:pic xmlns:pic="http://schemas.openxmlformats.org/drawingml/2006/picture">
-                  <pic:nvPicPr>
-                    <pic:cNvPr id="85425749" name=""/>
-                    <pic:cNvPicPr/>
-                  </pic:nvPicPr>
-                  <pic:blipFill>
-                    <a:blip r:embed="rId14"/>
-                    <a:stretch>
-                      <a:fillRect/>
-                    </a:stretch>
-                  </pic:blipFill>
-                  <pic:spPr>
-                    <a:xfrm>
-                      <a:off x="0" y="0"/>
-                      <a:ext cx="4733925" cy="2762250"/>
-                    </a:xfrm>
-                    <a:prstGeom prst="rect">
-                      <a:avLst/>
-                    </a:prstGeom>
-                  </pic:spPr>
-                </pic:pic>
-              </a:graphicData>
-            </a:graphic>
-          </wp:inline>
-        </w:drawing>
-      </w:r>
-    </w:p>
-    <w:p>
-      <w:pPr>
-        <w:pStyle w:val="ListParagraph"/>
-        <w:rPr>
-          <w:b/>
-          <w:bCs/>
-          <w:noProof/>
-          <w:lang w:eastAsia="ja-JP"/>
-        </w:rPr>
-      </w:pPr>
-    </w:p>
-    <w:p>
-      <w:pPr>
-        <w:pStyle w:val="ListParagraph"/>
-        <w:rPr>
-          <w:b/>
-          <w:bCs/>
-          <w:noProof/>
-          <w:lang w:eastAsia="ja-JP"/>
-        </w:rPr>
-      </w:pPr>
-    </w:p>
-    <w:p>
-      <w:pPr>
-        <w:pStyle w:val="ListParagraph"/>
-        <w:rPr>
-          <w:b/>
-          <w:bCs/>
-          <w:noProof/>
-          <w:lang w:eastAsia="ja-JP"/>
-        </w:rPr>
-      </w:pPr>
-    </w:p>
-    <w:p>
-      <w:pPr>
-        <w:pStyle w:val="ListParagraph"/>
-        <w:rPr>
-          <w:b/>
-          <w:bCs/>
-          <w:noProof/>
-          <w:lang w:eastAsia="ja-JP"/>
-        </w:rPr>
-      </w:pPr>
-    </w:p>
-    <w:p>
-      <w:pPr>
-        <w:pStyle w:val="ListParagraph"/>
-        <w:numPr>
-          <w:ilvl w:val="0"/>
-          <w:numId w:val="31"/>
-        </w:numPr>
-        <w:rPr>
-          <w:b/>
-          <w:bCs/>
-          <w:noProof/>
-          <w:lang w:eastAsia="ja-JP"/>
-        </w:rPr>
-      </w:pPr>
-      <w:r>
-        <w:rPr>
-          <w:b/>
-          <w:bCs/>
-          <w:noProof/>
-          <w:lang w:eastAsia="ja-JP"/>
-        </w:rPr>
-        <w:lastRenderedPageBreak/>
-        <w:t>Most Certain TN (Lowest Score):</w:t>
-      </w:r>
-      <w:r>
-        <w:rPr>
-          <w:noProof/>
-          <w:lang w:eastAsia="ja-JP"/>
-        </w:rPr>
-        <w:t xml:space="preserve"> </w:t>
-      </w:r>
-      <w:r>
-        <w:rPr>
-          <w:noProof/>
-          <w:lang w:eastAsia="ja-JP"/>
-        </w:rPr>
-        <w:t>This pair shows clearly different individuals, which the model correctly identified as 'Different' with high confidence.</w:t>
-      </w:r>
-      <w:r>
-        <w:rPr>
-          <w:b/>
-          <w:bCs/>
-          <w:noProof/>
-          <w:lang w:eastAsia="ja-JP"/>
-        </w:rPr>
-        <w:drawing>
-          <wp:inline distT="0" distB="0" distL="0" distR="0" wp14:anchorId="144CC884" wp14:editId="60B524DA">
-            <wp:extent cx="4733925" cy="2762250"/>
-            <wp:effectExtent l="0" t="0" r="9525" b="0"/>
-            <wp:docPr id="837432112" name="Picture 1"/>
-            <wp:cNvGraphicFramePr>
-              <a:graphicFrameLocks xmlns:a="http://schemas.openxmlformats.org/drawingml/2006/main" noChangeAspect="1"/>
-            </wp:cNvGraphicFramePr>
-            <a:graphic xmlns:a="http://schemas.openxmlformats.org/drawingml/2006/main">
-              <a:graphicData uri="http://schemas.openxmlformats.org/drawingml/2006/picture">
-                <pic:pic xmlns:pic="http://schemas.openxmlformats.org/drawingml/2006/picture">
-                  <pic:nvPicPr>
-                    <pic:cNvPr id="837432112" name=""/>
-                    <pic:cNvPicPr/>
-                  </pic:nvPicPr>
-                  <pic:blipFill>
                     <a:blip r:embed="rId15"/>
                     <a:stretch>
                       <a:fillRect/>
@@ -9775,7 +11037,7 @@
           <w:noProof/>
           <w:lang w:eastAsia="ja-JP"/>
         </w:rPr>
-        <w:t>Least Certain TN (Score ~ 0.5):</w:t>
+        <w:t>Least Certain TP (Score ~ 0.5):</w:t>
       </w:r>
       <w:r>
         <w:rPr>
@@ -9783,6 +11045,13 @@
           <w:lang w:eastAsia="ja-JP"/>
         </w:rPr>
         <w:t xml:space="preserve"> </w:t>
+      </w:r>
+      <w:r>
+        <w:rPr>
+          <w:noProof/>
+          <w:lang w:eastAsia="ja-JP"/>
+        </w:rPr>
+        <w:t xml:space="preserve">Different </w:t>
       </w:r>
       <w:r>
         <w:rPr>
@@ -9790,14 +11059,14 @@
           <w:noProof/>
           <w:lang w:eastAsia="ja-JP"/>
         </w:rPr>
-        <w:t>T</w:t>
+        <w:t xml:space="preserve">looking </w:t>
       </w:r>
       <w:r>
         <w:rPr>
           <w:noProof/>
           <w:lang w:eastAsia="ja-JP"/>
         </w:rPr>
-        <w:t xml:space="preserve">hese different individuals share some visual similarities. </w:t>
+        <w:t xml:space="preserve">glasses made this </w:t>
       </w:r>
       <w:r>
         <w:rPr>
@@ -9805,38 +11074,87 @@
           <w:noProof/>
           <w:lang w:eastAsia="ja-JP"/>
         </w:rPr>
-        <w:t>The</w:t>
+        <w:t>challenging</w:t>
       </w:r>
       <w:r>
         <w:rPr>
           <w:noProof/>
           <w:lang w:eastAsia="ja-JP"/>
         </w:rPr>
-        <w:t xml:space="preserve"> model correctly predicted 'Different' but with reduced certainty.</w:t>
-      </w:r>
-    </w:p>
-    <w:p>
-      <w:pPr>
-        <w:pStyle w:val="ListParagraph"/>
+        <w:t>,</w:t>
+      </w:r>
+      <w:r>
+        <w:rPr>
+          <w:rFonts w:hint="eastAsia"/>
+          <w:noProof/>
+          <w:lang w:eastAsia="ja-JP"/>
+        </w:rPr>
+        <w:t xml:space="preserve"> but</w:t>
+      </w:r>
+      <w:r>
+        <w:rPr>
+          <w:noProof/>
+          <w:lang w:eastAsia="ja-JP"/>
+        </w:rPr>
+        <w:t xml:space="preserve"> </w:t>
+      </w:r>
+      <w:r>
+        <w:rPr>
+          <w:rFonts w:hint="eastAsia"/>
+          <w:noProof/>
+          <w:lang w:eastAsia="ja-JP"/>
+        </w:rPr>
+        <w:t>t</w:t>
+      </w:r>
+      <w:r>
+        <w:rPr>
+          <w:noProof/>
+          <w:lang w:eastAsia="ja-JP"/>
+        </w:rPr>
+        <w:t>he model correctly predicted</w:t>
+      </w:r>
+      <w:r>
+        <w:rPr>
+          <w:rFonts w:hint="eastAsia"/>
+          <w:noProof/>
+          <w:lang w:eastAsia="ja-JP"/>
+        </w:rPr>
+        <w:t xml:space="preserve"> it </w:t>
+      </w:r>
+      <w:r>
+        <w:rPr>
+          <w:noProof/>
+          <w:lang w:eastAsia="ja-JP"/>
+        </w:rPr>
+        <w:t>with low certainty, likely relying on other consistent features</w:t>
+      </w:r>
+      <w:r>
+        <w:rPr>
+          <w:rFonts w:hint="eastAsia"/>
+          <w:noProof/>
+          <w:lang w:eastAsia="ja-JP"/>
+        </w:rPr>
+        <w:t xml:space="preserve"> (headphones)</w:t>
+      </w:r>
+      <w:r>
+        <w:rPr>
+          <w:noProof/>
+          <w:lang w:eastAsia="ja-JP"/>
+        </w:rPr>
+        <w:t>.</w:t>
+      </w:r>
+      <w:r>
         <w:rPr>
           <w:b/>
           <w:bCs/>
           <w:noProof/>
           <w:lang w:eastAsia="ja-JP"/>
         </w:rPr>
-      </w:pPr>
-      <w:r>
-        <w:rPr>
-          <w:b/>
-          <w:bCs/>
-          <w:noProof/>
-          <w:lang w:eastAsia="ja-JP"/>
-        </w:rPr>
         <w:drawing>
-          <wp:inline distT="0" distB="0" distL="0" distR="0" wp14:anchorId="1A74DDFD" wp14:editId="1074FE84">
+          <wp:inline distT="0" distB="0" distL="0" distR="0" wp14:anchorId="6FF04D72" wp14:editId="70D8003A">
             <wp:extent cx="4733925" cy="2762250"/>
             <wp:effectExtent l="0" t="0" r="9525" b="0"/>
-            <wp:docPr id="535994181" name="Picture 1"/>
+            <wp:docPr id="85425749" name="Picture 1"/>
             <wp:cNvGraphicFramePr>
               <a:graphicFrameLocks xmlns:a="http://schemas.openxmlformats.org/drawingml/2006/main" noChangeAspect="1"/>
             </wp:cNvGraphicFramePr>
@@ -9844,7 +11162,7 @@
               <a:graphicData uri="http://schemas.openxmlformats.org/drawingml/2006/picture">
                 <pic:pic xmlns:pic="http://schemas.openxmlformats.org/drawingml/2006/picture">
                   <pic:nvPicPr>
-                    <pic:cNvPr id="535994181" name=""/>
+                    <pic:cNvPr id="85425749" name=""/>
                     <pic:cNvPicPr/>
                   </pic:nvPicPr>
                   <pic:blipFill>
@@ -9916,72 +11234,6 @@
     <w:p>
       <w:pPr>
         <w:pStyle w:val="ListParagraph"/>
-        <w:rPr>
-          <w:b/>
-          <w:bCs/>
-          <w:noProof/>
-          <w:lang w:eastAsia="ja-JP"/>
-        </w:rPr>
-      </w:pPr>
-    </w:p>
-    <w:p>
-      <w:pPr>
-        <w:pStyle w:val="ListParagraph"/>
-        <w:rPr>
-          <w:b/>
-          <w:bCs/>
-          <w:noProof/>
-          <w:lang w:eastAsia="ja-JP"/>
-        </w:rPr>
-      </w:pPr>
-    </w:p>
-    <w:p>
-      <w:pPr>
-        <w:pStyle w:val="ListParagraph"/>
-        <w:rPr>
-          <w:b/>
-          <w:bCs/>
-          <w:noProof/>
-          <w:lang w:eastAsia="ja-JP"/>
-        </w:rPr>
-      </w:pPr>
-    </w:p>
-    <w:p>
-      <w:pPr>
-        <w:pStyle w:val="ListParagraph"/>
-        <w:rPr>
-          <w:b/>
-          <w:bCs/>
-          <w:noProof/>
-          <w:lang w:eastAsia="ja-JP"/>
-        </w:rPr>
-      </w:pPr>
-    </w:p>
-    <w:p>
-      <w:pPr>
-        <w:pStyle w:val="ListParagraph"/>
-        <w:rPr>
-          <w:b/>
-          <w:bCs/>
-          <w:noProof/>
-          <w:lang w:eastAsia="ja-JP"/>
-        </w:rPr>
-      </w:pPr>
-    </w:p>
-    <w:p>
-      <w:pPr>
-        <w:pStyle w:val="ListParagraph"/>
-        <w:rPr>
-          <w:b/>
-          <w:bCs/>
-          <w:noProof/>
-          <w:lang w:eastAsia="ja-JP"/>
-        </w:rPr>
-      </w:pPr>
-    </w:p>
-    <w:p>
-      <w:pPr>
-        <w:pStyle w:val="ListParagraph"/>
         <w:numPr>
           <w:ilvl w:val="0"/>
           <w:numId w:val="31"/>
@@ -10001,7 +11253,7 @@
           <w:lang w:eastAsia="ja-JP"/>
         </w:rPr>
         <w:lastRenderedPageBreak/>
-        <w:t>Most Certain FP (Highest Score - Predicted Same, Actual Different):</w:t>
+        <w:t>Most Certain TN (Lowest Score):</w:t>
       </w:r>
       <w:r>
         <w:rPr>
@@ -10015,7 +11267,7 @@
           <w:noProof/>
           <w:lang w:eastAsia="ja-JP"/>
         </w:rPr>
-        <w:t>Although these different individuals have clear visual distinctions, the model incorrectly predicted 'Same' with high confidence, likely focusing strongly on misleading similarities.</w:t>
+        <w:t>This pair shows clearly different individuals, which the model correctly identified as 'Different' with high confidence.</w:t>
       </w:r>
       <w:r>
         <w:rPr>
@@ -10025,10 +11277,10 @@
           <w:lang w:eastAsia="ja-JP"/>
         </w:rPr>
         <w:drawing>
-          <wp:inline distT="0" distB="0" distL="0" distR="0" wp14:anchorId="6728C54A" wp14:editId="2225955B">
+          <wp:inline distT="0" distB="0" distL="0" distR="0" wp14:anchorId="144CC884" wp14:editId="60B524DA">
             <wp:extent cx="4733925" cy="2762250"/>
             <wp:effectExtent l="0" t="0" r="9525" b="0"/>
-            <wp:docPr id="915032531" name="Picture 1"/>
+            <wp:docPr id="837432112" name="Picture 1"/>
             <wp:cNvGraphicFramePr>
               <a:graphicFrameLocks xmlns:a="http://schemas.openxmlformats.org/drawingml/2006/main" noChangeAspect="1"/>
             </wp:cNvGraphicFramePr>
@@ -10036,7 +11288,7 @@
               <a:graphicData uri="http://schemas.openxmlformats.org/drawingml/2006/picture">
                 <pic:pic xmlns:pic="http://schemas.openxmlformats.org/drawingml/2006/picture">
                   <pic:nvPicPr>
-                    <pic:cNvPr id="915032531" name=""/>
+                    <pic:cNvPr id="837432112" name=""/>
                     <pic:cNvPicPr/>
                   </pic:nvPicPr>
                   <pic:blipFill>
@@ -10064,17 +11316,6 @@
     <w:p>
       <w:pPr>
         <w:pStyle w:val="ListParagraph"/>
-        <w:rPr>
-          <w:b/>
-          <w:bCs/>
-          <w:noProof/>
-          <w:lang w:eastAsia="ja-JP"/>
-        </w:rPr>
-      </w:pPr>
-    </w:p>
-    <w:p>
-      <w:pPr>
-        <w:pStyle w:val="ListParagraph"/>
         <w:numPr>
           <w:ilvl w:val="0"/>
           <w:numId w:val="31"/>
@@ -10093,7 +11334,7 @@
           <w:noProof/>
           <w:lang w:eastAsia="ja-JP"/>
         </w:rPr>
-        <w:t>Least Certain FP (Score ~ 0.5 - Predicted Same, Actual Different):</w:t>
+        <w:t>Least Certain TN (Score ~ 0.5):</w:t>
       </w:r>
       <w:r>
         <w:rPr>
@@ -10104,23 +11345,57 @@
       </w:r>
       <w:r>
         <w:rPr>
+          <w:rFonts w:hint="eastAsia"/>
           <w:noProof/>
           <w:lang w:eastAsia="ja-JP"/>
         </w:rPr>
-        <w:t>Shared similarities between these different individuals likely confused the model, leading to an incorrect 'Same' prediction made with low certainty.</w:t>
-      </w:r>
-      <w:r>
+        <w:t>T</w:t>
+      </w:r>
+      <w:r>
+        <w:rPr>
+          <w:noProof/>
+          <w:lang w:eastAsia="ja-JP"/>
+        </w:rPr>
+        <w:t xml:space="preserve">hese different individuals share some visual similarities. </w:t>
+      </w:r>
+      <w:r>
+        <w:rPr>
+          <w:rFonts w:hint="eastAsia"/>
+          <w:noProof/>
+          <w:lang w:eastAsia="ja-JP"/>
+        </w:rPr>
+        <w:t>The</w:t>
+      </w:r>
+      <w:r>
+        <w:rPr>
+          <w:noProof/>
+          <w:lang w:eastAsia="ja-JP"/>
+        </w:rPr>
+        <w:t xml:space="preserve"> model correctly predicted 'Different' but with reduced certainty.</w:t>
+      </w:r>
+    </w:p>
+    <w:p>
+      <w:pPr>
+        <w:pStyle w:val="ListParagraph"/>
         <w:rPr>
           <w:b/>
           <w:bCs/>
           <w:noProof/>
           <w:lang w:eastAsia="ja-JP"/>
         </w:rPr>
+      </w:pPr>
+      <w:r>
+        <w:rPr>
+          <w:b/>
+          <w:bCs/>
+          <w:noProof/>
+          <w:lang w:eastAsia="ja-JP"/>
+        </w:rPr>
         <w:drawing>
-          <wp:inline distT="0" distB="0" distL="0" distR="0" wp14:anchorId="641FA172" wp14:editId="2C8175B2">
+          <wp:inline distT="0" distB="0" distL="0" distR="0" wp14:anchorId="1A74DDFD" wp14:editId="1074FE84">
             <wp:extent cx="4733925" cy="2762250"/>
             <wp:effectExtent l="0" t="0" r="9525" b="0"/>
-            <wp:docPr id="1703435417" name="Picture 1"/>
+            <wp:docPr id="535994181" name="Picture 1"/>
             <wp:cNvGraphicFramePr>
               <a:graphicFrameLocks xmlns:a="http://schemas.openxmlformats.org/drawingml/2006/main" noChangeAspect="1"/>
             </wp:cNvGraphicFramePr>
@@ -10128,7 +11403,7 @@
               <a:graphicData uri="http://schemas.openxmlformats.org/drawingml/2006/picture">
                 <pic:pic xmlns:pic="http://schemas.openxmlformats.org/drawingml/2006/picture">
                   <pic:nvPicPr>
-                    <pic:cNvPr id="1703435417" name=""/>
+                    <pic:cNvPr id="535994181" name=""/>
                     <pic:cNvPicPr/>
                   </pic:nvPicPr>
                   <pic:blipFill>
@@ -10188,7 +11463,51 @@
     </w:p>
     <w:p>
       <w:pPr>
-        <w:ind w:left="360"/>
+        <w:pStyle w:val="ListParagraph"/>
+        <w:rPr>
+          <w:b/>
+          <w:bCs/>
+          <w:noProof/>
+          <w:lang w:eastAsia="ja-JP"/>
+        </w:rPr>
+      </w:pPr>
+    </w:p>
+    <w:p>
+      <w:pPr>
+        <w:pStyle w:val="ListParagraph"/>
+        <w:rPr>
+          <w:b/>
+          <w:bCs/>
+          <w:noProof/>
+          <w:lang w:eastAsia="ja-JP"/>
+        </w:rPr>
+      </w:pPr>
+    </w:p>
+    <w:p>
+      <w:pPr>
+        <w:pStyle w:val="ListParagraph"/>
+        <w:rPr>
+          <w:b/>
+          <w:bCs/>
+          <w:noProof/>
+          <w:lang w:eastAsia="ja-JP"/>
+        </w:rPr>
+      </w:pPr>
+    </w:p>
+    <w:p>
+      <w:pPr>
+        <w:pStyle w:val="ListParagraph"/>
+        <w:rPr>
+          <w:b/>
+          <w:bCs/>
+          <w:noProof/>
+          <w:lang w:eastAsia="ja-JP"/>
+        </w:rPr>
+      </w:pPr>
+    </w:p>
+    <w:p>
+      <w:pPr>
+        <w:pStyle w:val="ListParagraph"/>
         <w:rPr>
           <w:b/>
           <w:bCs/>
@@ -10241,7 +11560,7 @@
           <w:lang w:eastAsia="ja-JP"/>
         </w:rPr>
         <w:lastRenderedPageBreak/>
-        <w:t>Most Certain FN (Lowest Score - Predicted Different, Actual Same):</w:t>
+        <w:t>Most Certain FP (Highest Score - Predicted Same, Actual Different):</w:t>
       </w:r>
       <w:r>
         <w:rPr>
@@ -10255,46 +11574,20 @@
           <w:noProof/>
           <w:lang w:eastAsia="ja-JP"/>
         </w:rPr>
-        <w:t xml:space="preserve">Major visual changes (e.g., hat, hair, expression) between images of the same person caused the model to confidently, </w:t>
-      </w:r>
-      <w:r>
-        <w:rPr>
-          <w:rFonts w:hint="eastAsia"/>
-          <w:noProof/>
-          <w:lang w:eastAsia="ja-JP"/>
-        </w:rPr>
-        <w:t>but</w:t>
-      </w:r>
-      <w:r>
-        <w:rPr>
-          <w:noProof/>
-          <w:lang w:eastAsia="ja-JP"/>
-        </w:rPr>
-        <w:t xml:space="preserve"> incorrectly, predict 'Different'.</w:t>
-      </w:r>
-    </w:p>
-    <w:p>
-      <w:pPr>
-        <w:pStyle w:val="ListParagraph"/>
+        <w:t>Although these different individuals have clear visual distinctions, the model incorrectly predicted 'Same' with high confidence, likely focusing strongly on misleading similarities.</w:t>
+      </w:r>
+      <w:r>
         <w:rPr>
           <w:b/>
           <w:bCs/>
           <w:noProof/>
           <w:lang w:eastAsia="ja-JP"/>
         </w:rPr>
-      </w:pPr>
-      <w:r>
-        <w:rPr>
-          <w:b/>
-          <w:bCs/>
-          <w:noProof/>
-          <w:lang w:eastAsia="ja-JP"/>
-        </w:rPr>
         <w:drawing>
-          <wp:inline distT="0" distB="0" distL="0" distR="0" wp14:anchorId="74620F86" wp14:editId="70FA700D">
+          <wp:inline distT="0" distB="0" distL="0" distR="0" wp14:anchorId="6728C54A" wp14:editId="2225955B">
             <wp:extent cx="4733925" cy="2762250"/>
             <wp:effectExtent l="0" t="0" r="9525" b="0"/>
-            <wp:docPr id="2107635920" name="Picture 1"/>
+            <wp:docPr id="915032531" name="Picture 1"/>
             <wp:cNvGraphicFramePr>
               <a:graphicFrameLocks xmlns:a="http://schemas.openxmlformats.org/drawingml/2006/main" noChangeAspect="1"/>
             </wp:cNvGraphicFramePr>
@@ -10302,7 +11595,7 @@
               <a:graphicData uri="http://schemas.openxmlformats.org/drawingml/2006/picture">
                 <pic:pic xmlns:pic="http://schemas.openxmlformats.org/drawingml/2006/picture">
                   <pic:nvPicPr>
-                    <pic:cNvPr id="2107635920" name=""/>
+                    <pic:cNvPr id="915032531" name=""/>
                     <pic:cNvPicPr/>
                   </pic:nvPicPr>
                   <pic:blipFill>
@@ -10330,6 +11623,17 @@
     <w:p>
       <w:pPr>
         <w:pStyle w:val="ListParagraph"/>
+        <w:rPr>
+          <w:b/>
+          <w:bCs/>
+          <w:noProof/>
+          <w:lang w:eastAsia="ja-JP"/>
+        </w:rPr>
+      </w:pPr>
+    </w:p>
+    <w:p>
+      <w:pPr>
+        <w:pStyle w:val="ListParagraph"/>
         <w:numPr>
           <w:ilvl w:val="0"/>
           <w:numId w:val="31"/>
@@ -10348,7 +11652,7 @@
           <w:noProof/>
           <w:lang w:eastAsia="ja-JP"/>
         </w:rPr>
-        <w:t>Least Certain FN (Score ~ 0.5 - Predicted Different, Actual Same):</w:t>
+        <w:t>Least Certain FP (Score ~ 0.5 - Predicted Same, Actual Different):</w:t>
       </w:r>
       <w:r>
         <w:rPr>
@@ -10362,7 +11666,7 @@
           <w:noProof/>
           <w:lang w:eastAsia="ja-JP"/>
         </w:rPr>
-        <w:t>Appearance variations (e.g., hair color, expression) for the same person created uncertainty, resulting in an incorrect 'Different' prediction with a score just below the threshold.</w:t>
+        <w:t>Shared similarities between these different individuals likely confused the model, leading to an incorrect 'Same' prediction made with low certainty.</w:t>
       </w:r>
       <w:r>
         <w:rPr>
@@ -10372,10 +11676,10 @@
           <w:lang w:eastAsia="ja-JP"/>
         </w:rPr>
         <w:drawing>
-          <wp:inline distT="0" distB="0" distL="0" distR="0" wp14:anchorId="19198525" wp14:editId="0315A01B">
+          <wp:inline distT="0" distB="0" distL="0" distR="0" wp14:anchorId="641FA172" wp14:editId="2C8175B2">
             <wp:extent cx="4733925" cy="2762250"/>
             <wp:effectExtent l="0" t="0" r="9525" b="0"/>
-            <wp:docPr id="991365331" name="Picture 1"/>
+            <wp:docPr id="1703435417" name="Picture 1"/>
             <wp:cNvGraphicFramePr>
               <a:graphicFrameLocks xmlns:a="http://schemas.openxmlformats.org/drawingml/2006/main" noChangeAspect="1"/>
             </wp:cNvGraphicFramePr>
@@ -10383,7 +11687,7 @@
               <a:graphicData uri="http://schemas.openxmlformats.org/drawingml/2006/picture">
                 <pic:pic xmlns:pic="http://schemas.openxmlformats.org/drawingml/2006/picture">
                   <pic:nvPicPr>
-                    <pic:cNvPr id="991365331" name=""/>
+                    <pic:cNvPr id="1703435417" name=""/>
                     <pic:cNvPicPr/>
                   </pic:nvPicPr>
                   <pic:blipFill>
@@ -10410,6 +11714,261 @@
     </w:p>
     <w:p>
       <w:pPr>
+        <w:pStyle w:val="ListParagraph"/>
+        <w:rPr>
+          <w:b/>
+          <w:bCs/>
+          <w:noProof/>
+          <w:lang w:eastAsia="ja-JP"/>
+        </w:rPr>
+      </w:pPr>
+    </w:p>
+    <w:p>
+      <w:pPr>
+        <w:pStyle w:val="ListParagraph"/>
+        <w:rPr>
+          <w:b/>
+          <w:bCs/>
+          <w:noProof/>
+          <w:lang w:eastAsia="ja-JP"/>
+        </w:rPr>
+      </w:pPr>
+    </w:p>
+    <w:p>
+      <w:pPr>
+        <w:pStyle w:val="ListParagraph"/>
+        <w:rPr>
+          <w:b/>
+          <w:bCs/>
+          <w:noProof/>
+          <w:lang w:eastAsia="ja-JP"/>
+        </w:rPr>
+      </w:pPr>
+    </w:p>
+    <w:p>
+      <w:pPr>
+        <w:ind w:left="360"/>
+        <w:rPr>
+          <w:b/>
+          <w:bCs/>
+          <w:noProof/>
+          <w:lang w:eastAsia="ja-JP"/>
+        </w:rPr>
+      </w:pPr>
+    </w:p>
+    <w:p>
+      <w:pPr>
+        <w:pStyle w:val="ListParagraph"/>
+        <w:rPr>
+          <w:b/>
+          <w:bCs/>
+          <w:noProof/>
+          <w:lang w:eastAsia="ja-JP"/>
+        </w:rPr>
+      </w:pPr>
+    </w:p>
+    <w:p>
+      <w:pPr>
+        <w:pStyle w:val="ListParagraph"/>
+        <w:rPr>
+          <w:b/>
+          <w:bCs/>
+          <w:noProof/>
+          <w:lang w:eastAsia="ja-JP"/>
+        </w:rPr>
+      </w:pPr>
+    </w:p>
+    <w:p>
+      <w:pPr>
+        <w:pStyle w:val="ListParagraph"/>
+        <w:numPr>
+          <w:ilvl w:val="0"/>
+          <w:numId w:val="31"/>
+        </w:numPr>
+        <w:rPr>
+          <w:b/>
+          <w:bCs/>
+          <w:noProof/>
+          <w:lang w:eastAsia="ja-JP"/>
+        </w:rPr>
+      </w:pPr>
+      <w:r>
+        <w:rPr>
+          <w:b/>
+          <w:bCs/>
+          <w:noProof/>
+          <w:lang w:eastAsia="ja-JP"/>
+        </w:rPr>
+        <w:lastRenderedPageBreak/>
+        <w:t>Most Certain FN (Lowest Score - Predicted Different, Actual Same):</w:t>
+      </w:r>
+      <w:r>
+        <w:rPr>
+          <w:noProof/>
+          <w:lang w:eastAsia="ja-JP"/>
+        </w:rPr>
+        <w:t xml:space="preserve"> </w:t>
+      </w:r>
+      <w:r>
+        <w:rPr>
+          <w:noProof/>
+          <w:lang w:eastAsia="ja-JP"/>
+        </w:rPr>
+        <w:t xml:space="preserve">Major visual changes (e.g., hat, hair, expression) between images of the same person caused the model to confidently, </w:t>
+      </w:r>
+      <w:r>
+        <w:rPr>
+          <w:rFonts w:hint="eastAsia"/>
+          <w:noProof/>
+          <w:lang w:eastAsia="ja-JP"/>
+        </w:rPr>
+        <w:t>but</w:t>
+      </w:r>
+      <w:r>
+        <w:rPr>
+          <w:noProof/>
+          <w:lang w:eastAsia="ja-JP"/>
+        </w:rPr>
+        <w:t xml:space="preserve"> incorrectly, predict 'Different'.</w:t>
+      </w:r>
+    </w:p>
+    <w:p>
+      <w:pPr>
+        <w:pStyle w:val="ListParagraph"/>
+        <w:rPr>
+          <w:b/>
+          <w:bCs/>
+          <w:noProof/>
+          <w:lang w:eastAsia="ja-JP"/>
+        </w:rPr>
+      </w:pPr>
+      <w:r>
+        <w:rPr>
+          <w:b/>
+          <w:bCs/>
+          <w:noProof/>
+          <w:lang w:eastAsia="ja-JP"/>
+        </w:rPr>
+        <w:drawing>
+          <wp:inline distT="0" distB="0" distL="0" distR="0" wp14:anchorId="74620F86" wp14:editId="70FA700D">
+            <wp:extent cx="4733925" cy="2762250"/>
+            <wp:effectExtent l="0" t="0" r="9525" b="0"/>
+            <wp:docPr id="2107635920" name="Picture 1"/>
+            <wp:cNvGraphicFramePr>
+              <a:graphicFrameLocks xmlns:a="http://schemas.openxmlformats.org/drawingml/2006/main" noChangeAspect="1"/>
+            </wp:cNvGraphicFramePr>
+            <a:graphic xmlns:a="http://schemas.openxmlformats.org/drawingml/2006/main">
+              <a:graphicData uri="http://schemas.openxmlformats.org/drawingml/2006/picture">
+                <pic:pic xmlns:pic="http://schemas.openxmlformats.org/drawingml/2006/picture">
+                  <pic:nvPicPr>
+                    <pic:cNvPr id="2107635920" name=""/>
+                    <pic:cNvPicPr/>
+                  </pic:nvPicPr>
+                  <pic:blipFill>
+                    <a:blip r:embed="rId21"/>
+                    <a:stretch>
+                      <a:fillRect/>
+                    </a:stretch>
+                  </pic:blipFill>
+                  <pic:spPr>
+                    <a:xfrm>
+                      <a:off x="0" y="0"/>
+                      <a:ext cx="4733925" cy="2762250"/>
+                    </a:xfrm>
+                    <a:prstGeom prst="rect">
+                      <a:avLst/>
+                    </a:prstGeom>
+                  </pic:spPr>
+                </pic:pic>
+              </a:graphicData>
+            </a:graphic>
+          </wp:inline>
+        </w:drawing>
+      </w:r>
+    </w:p>
+    <w:p>
+      <w:pPr>
+        <w:pStyle w:val="ListParagraph"/>
+        <w:numPr>
+          <w:ilvl w:val="0"/>
+          <w:numId w:val="31"/>
+        </w:numPr>
+        <w:rPr>
+          <w:b/>
+          <w:bCs/>
+          <w:noProof/>
+          <w:lang w:eastAsia="ja-JP"/>
+        </w:rPr>
+      </w:pPr>
+      <w:r>
+        <w:rPr>
+          <w:b/>
+          <w:bCs/>
+          <w:noProof/>
+          <w:lang w:eastAsia="ja-JP"/>
+        </w:rPr>
+        <w:t>Least Certain FN (Score ~ 0.5 - Predicted Different, Actual Same):</w:t>
+      </w:r>
+      <w:r>
+        <w:rPr>
+          <w:noProof/>
+          <w:lang w:eastAsia="ja-JP"/>
+        </w:rPr>
+        <w:t xml:space="preserve"> </w:t>
+      </w:r>
+      <w:r>
+        <w:rPr>
+          <w:noProof/>
+          <w:lang w:eastAsia="ja-JP"/>
+        </w:rPr>
+        <w:t>Appearance variations (e.g., hair color, expression) for the same person created uncertainty, resulting in an incorrect 'Different' prediction with a score just below the threshold.</w:t>
+      </w:r>
+      <w:r>
+        <w:rPr>
+          <w:b/>
+          <w:bCs/>
+          <w:noProof/>
+          <w:lang w:eastAsia="ja-JP"/>
+        </w:rPr>
+        <w:drawing>
+          <wp:inline distT="0" distB="0" distL="0" distR="0" wp14:anchorId="19198525" wp14:editId="0315A01B">
+            <wp:extent cx="4733925" cy="2762250"/>
+            <wp:effectExtent l="0" t="0" r="9525" b="0"/>
+            <wp:docPr id="991365331" name="Picture 1"/>
+            <wp:cNvGraphicFramePr>
+              <a:graphicFrameLocks xmlns:a="http://schemas.openxmlformats.org/drawingml/2006/main" noChangeAspect="1"/>
+            </wp:cNvGraphicFramePr>
+            <a:graphic xmlns:a="http://schemas.openxmlformats.org/drawingml/2006/main">
+              <a:graphicData uri="http://schemas.openxmlformats.org/drawingml/2006/picture">
+                <pic:pic xmlns:pic="http://schemas.openxmlformats.org/drawingml/2006/picture">
+                  <pic:nvPicPr>
+                    <pic:cNvPr id="991365331" name=""/>
+                    <pic:cNvPicPr/>
+                  </pic:nvPicPr>
+                  <pic:blipFill>
+                    <a:blip r:embed="rId22"/>
+                    <a:stretch>
+                      <a:fillRect/>
+                    </a:stretch>
+                  </pic:blipFill>
+                  <pic:spPr>
+                    <a:xfrm>
+                      <a:off x="0" y="0"/>
+                      <a:ext cx="4733925" cy="2762250"/>
+                    </a:xfrm>
+                    <a:prstGeom prst="rect">
+                      <a:avLst/>
+                    </a:prstGeom>
+                  </pic:spPr>
+                </pic:pic>
+              </a:graphicData>
+            </a:graphic>
+          </wp:inline>
+        </w:drawing>
+      </w:r>
+    </w:p>
+    <w:p>
+      <w:pPr>
         <w:ind w:left="360"/>
         <w:rPr>
           <w:noProof/>
@@ -12237,8 +13796,8 @@
   <w:abstractNum w:abstractNumId="15" w15:restartNumberingAfterBreak="0">
     <w:nsid w:val="599F0435"/>
     <w:multiLevelType w:val="hybridMultilevel"/>
-    <w:tmpl w:val="61321D64"/>
-    <w:lvl w:ilvl="0" w:tplc="0409000F">
+    <w:tmpl w:val="13A4C5CE"/>
+    <w:lvl w:ilvl="0" w:tplc="21A2A90C">
       <w:start w:val="1"/>
       <w:numFmt w:val="decimal"/>
       <w:lvlText w:val="%1."/>
@@ -12248,6 +13807,8 @@
       </w:pPr>
       <w:rPr>
         <w:rFonts w:hint="default"/>
+        <w:b/>
+        <w:bCs/>
       </w:rPr>
     </w:lvl>
     <w:lvl w:ilvl="1" w:tplc="04090019">
@@ -14464,6 +16025,7 @@
   <w:style w:type="character" w:default="1" w:styleId="DefaultParagraphFont">
     <w:name w:val="Default Paragraph Font"/>
     <w:uiPriority w:val="1"/>
+    <w:semiHidden/>
     <w:unhideWhenUsed/>
   </w:style>
   <w:style w:type="table" w:default="1" w:styleId="TableNormal">

</xml_diff>